<commit_message>
chore: optimize implementation roadmap to 8-week intensive sprint
</commit_message>
<xml_diff>
--- a/docs/DACN.docx
+++ b/docs/DACN.docx
@@ -12,7 +12,7 @@
           <w:color w:val="0066CC"/>
           <w:sz w:val="21"/>
         </w:rPr>
-        <w:t>BẢN ĐỀ CƯƠNG &amp; THIẾT KẾ KỸ THUẬT ĐỒ ÁN CHUYÊN NGÀNH</w:t>
+        <w:t>BẢN ĐỀ CƯƠNG &amp; KẾ HOẠCH TRIỂN KHAI 8 TUẦN (RÚT GỌN)</w:t>
       </w:r>
     </w:p>
     <w:p>
@@ -24,7 +24,7 @@
         <w:rPr>
           <w:b/>
           <w:color w:val="102C57"/>
-          <w:sz w:val="27"/>
+          <w:sz w:val="26"/>
         </w:rPr>
         <w:t>HỆ THỐNG MULTI-AGENT AI TỰ CHỦ THU THẬP, TRÍCH XUẤT CHỈ SỐ MỐI ĐE DỌA (IOCs),</w:t>
         <w:br/>
@@ -176,11 +176,11 @@
                 <w:b/>
                 <w:color w:val="00468C"/>
               </w:rPr>
-              <w:t>TỔNG QUAN ĐỀ TÀI TRONG 30 GIÂY:</w:t>
+              <w:t>LỘ TRÌNH TỐI ƯU 8 TUẦN (INTENSIVE SPRINT):</w:t>
               <w:br/>
             </w:r>
             <w:r>
-              <w:t>Hệ thống tự động hóa toàn bộ quy trình Tình báo Mối đe dọa (Cyber Threat Intelligence - CTI): Lâm xây dựng Engine cào dữ liệu từ các báo cáo bảo mật, tin tức APT, CVE mới -&gt; Phúc dùng Multi-Agent bóc tách các chỉ số IOCs (IP, Domain, File Hash, CVE) và ánh xạ sang ma trận MITRE ATT&amp;CK -&gt; Khang tích hợp VirusTotal/AbuseIPDB để kiểm tra độ độc hại và xuất dữ liệu STIX 2.1 -&gt; Hệ thống tự động sinh quy tắc phòng thủ (Sigma/YARA rules) và hiển thị bản đồ trực quan trên Web Dashboard.</w:t>
+              <w:t>Để hoàn thành đồ án xuất sắc trong 8 tuần, khối lượng công việc được tinh gọn thành 4 giai đoạn trọng tâm: Tuần 1 (Thiết kế &amp; Khung dự án) -&gt; Tuần 2-4 (Xây dựng 3 Module cốt lõi chạy song song) -&gt; Tuần 5-6 (Ghép nối hệ thống End-to-End &amp; Dashboard trực quan) -&gt; Tuần 7-8 (Đo đạc Benchmark 50 báo cáo, Viết báo cáo &amp; Bảo vệ).</w:t>
             </w:r>
           </w:p>
         </w:tc>
@@ -201,855 +201,7 @@
           <w:color w:val="102C57"/>
           <w:sz w:val="25"/>
         </w:rPr>
-        <w:t>1. BÀI TOÁN THỰC TIỄN &amp; GIẢI PHÁP ĐỘT PHÁ CỦA AI AGENT</w:t>
-      </w:r>
-    </w:p>
-    <w:tbl>
-      <w:tblPr>
-        <w:tblW w:type="auto" w:w="0"/>
-        <w:jc w:val="center"/>
-        <w:tblLook w:firstColumn="1" w:firstRow="1" w:lastColumn="0" w:lastRow="0" w:noHBand="0" w:noVBand="1" w:val="04A0"/>
-      </w:tblPr>
-      <w:tblGrid>
-        <w:gridCol w:w="4968"/>
-        <w:gridCol w:w="4968"/>
-      </w:tblGrid>
-      <w:tr>
-        <w:tc>
-          <w:tcPr>
-            <w:tcW w:type="dxa" w:w="4968"/>
-            <w:shd w:fill="2D3748"/>
-          </w:tcPr>
-          <w:p>
-            <w:pPr>
-              <w:jc w:val="center"/>
-            </w:pPr>
-            <w:r>
-              <w:rPr>
-                <w:b/>
-                <w:color w:val="FFFFFF"/>
-                <w:sz w:val="19"/>
-              </w:rPr>
-              <w:t>❌ KHÓ KHĂN CỦA CHUYÊN VIÊN SOC / CTI HIỆN NAY</w:t>
-            </w:r>
-          </w:p>
-        </w:tc>
-        <w:tc>
-          <w:tcPr>
-            <w:tcW w:type="dxa" w:w="4968"/>
-            <w:shd w:fill="0F5132"/>
-          </w:tcPr>
-          <w:p>
-            <w:pPr>
-              <w:jc w:val="center"/>
-            </w:pPr>
-            <w:r>
-              <w:rPr>
-                <w:b/>
-                <w:color w:val="FFFFFF"/>
-                <w:sz w:val="19"/>
-              </w:rPr>
-              <w:t>✅ GIẢI PHÁP CỦA HỆ THỐNG AI AGENT CTI</w:t>
-            </w:r>
-          </w:p>
-        </w:tc>
-      </w:tr>
-      <w:tr>
-        <w:tc>
-          <w:tcPr>
-            <w:tcW w:type="dxa" w:w="4968"/>
-            <w:shd w:fill="F8F9FA"/>
-            <w:tcMar>
-              <w:top w:w="60" w:type="dxa"/>
-              <w:bottom w:w="60" w:type="dxa"/>
-              <w:left w:w="80" w:type="dxa"/>
-              <w:right w:w="80" w:type="dxa"/>
-            </w:tcMar>
-          </w:tcPr>
-          <w:p>
-            <w:r>
-              <w:t>• Quá tải thông tin (Information Overload): Hàng trăm báo cáo APT, tin mã độc xuất hiện mỗi ngày, chuyên gia đọc thủ công không xuể.</w:t>
-              <w:br/>
-              <w:t>• Bỏ sót các chỉ số IOCs quan trọng ẩn trong văn bản dài hàng chục trang.</w:t>
-            </w:r>
-          </w:p>
-        </w:tc>
-        <w:tc>
-          <w:tcPr>
-            <w:tcW w:type="dxa" w:w="4968"/>
-            <w:shd w:fill="F8F9FA"/>
-            <w:tcMar>
-              <w:top w:w="60" w:type="dxa"/>
-              <w:bottom w:w="60" w:type="dxa"/>
-              <w:left w:w="80" w:type="dxa"/>
-              <w:right w:w="80" w:type="dxa"/>
-            </w:tcMar>
-          </w:tcPr>
-          <w:p>
-            <w:r>
-              <w:t>• AI Agent tự động cào tin và đọc hiểu văn bản phi cấu trúc trong vài giây.</w:t>
-              <w:br/>
-              <w:t>• Tự động trích xuất chính xác 100% các IOC (IP, Hash, Domain, CVE) kèm ngữ cảnh xuất hiện.</w:t>
-            </w:r>
-          </w:p>
-        </w:tc>
-      </w:tr>
-      <w:tr>
-        <w:tc>
-          <w:tcPr>
-            <w:tcW w:type="dxa" w:w="4968"/>
-            <w:shd w:fill="FFFFFF"/>
-            <w:tcMar>
-              <w:top w:w="60" w:type="dxa"/>
-              <w:bottom w:w="60" w:type="dxa"/>
-              <w:left w:w="80" w:type="dxa"/>
-              <w:right w:w="80" w:type="dxa"/>
-            </w:tcMar>
-          </w:tcPr>
-          <w:p>
-            <w:r>
-              <w:t>• Mất nhiều giờ tra cứu thủ công từng IP/Hash trên VirusTotal/Shodan.</w:t>
-              <w:br/>
-              <w:t>• Khó khăn trong việc ánh xạ hành vi sang ma trận MITRE ATT&amp;CK và viết rule phòng thủ kịp thời.</w:t>
-            </w:r>
-          </w:p>
-        </w:tc>
-        <w:tc>
-          <w:tcPr>
-            <w:tcW w:type="dxa" w:w="4968"/>
-            <w:shd w:fill="FFFFFF"/>
-            <w:tcMar>
-              <w:top w:w="60" w:type="dxa"/>
-              <w:bottom w:w="60" w:type="dxa"/>
-              <w:left w:w="80" w:type="dxa"/>
-              <w:right w:w="80" w:type="dxa"/>
-            </w:tcMar>
-          </w:tcPr>
-          <w:p>
-            <w:r>
-              <w:t>• Tự động gọi API làm giàu dữ liệu (Threat Enrichment), tính điểm đe dọa.</w:t>
-              <w:br/>
-              <w:t>• Tự động ánh xạ kỹ thuật MITRE ATT&amp;CK và tự sinh rule YARA/Sigma nạp thẳng vào SIEM/Firewall.</w:t>
-            </w:r>
-          </w:p>
-        </w:tc>
-      </w:tr>
-    </w:tbl>
-    <w:p>
-      <w:r>
-        <w:br w:type="page"/>
-      </w:r>
-    </w:p>
-    <w:p>
-      <w:pPr>
-        <w:spacing w:before="240" w:after="80"/>
-      </w:pPr>
-      <w:r>
-        <w:rPr>
-          <w:b/>
-          <w:color w:val="102C57"/>
-          <w:sz w:val="25"/>
-        </w:rPr>
-        <w:t>2. KIẾN TRÚC HỆ THỐNG MULTI-AGENT CTI (4 PHA VẬN HÀNH)</w:t>
-      </w:r>
-    </w:p>
-    <w:tbl>
-      <w:tblPr>
-        <w:tblW w:type="auto" w:w="0"/>
-        <w:jc w:val="center"/>
-        <w:tblLook w:firstColumn="1" w:firstRow="1" w:lastColumn="0" w:lastRow="0" w:noHBand="0" w:noVBand="1" w:val="04A0"/>
-      </w:tblPr>
-      <w:tblGrid>
-        <w:gridCol w:w="2484"/>
-        <w:gridCol w:w="2484"/>
-        <w:gridCol w:w="2484"/>
-        <w:gridCol w:w="2484"/>
-      </w:tblGrid>
-      <w:tr>
-        <w:tc>
-          <w:tcPr>
-            <w:tcW w:type="dxa" w:w="2484"/>
-            <w:shd w:fill="1E3A8A"/>
-          </w:tcPr>
-          <w:p>
-            <w:r>
-              <w:rPr>
-                <w:b/>
-                <w:color w:val="FFFFFF"/>
-                <w:sz w:val="18"/>
-              </w:rPr>
-              <w:t>BƯỚC</w:t>
-            </w:r>
-          </w:p>
-        </w:tc>
-        <w:tc>
-          <w:tcPr>
-            <w:tcW w:type="dxa" w:w="2484"/>
-            <w:shd w:fill="1E3A8A"/>
-          </w:tcPr>
-          <w:p>
-            <w:r>
-              <w:rPr>
-                <w:b/>
-                <w:color w:val="FFFFFF"/>
-                <w:sz w:val="18"/>
-              </w:rPr>
-              <w:t>THÀNH VIÊN</w:t>
-            </w:r>
-          </w:p>
-        </w:tc>
-        <w:tc>
-          <w:tcPr>
-            <w:tcW w:type="dxa" w:w="2484"/>
-            <w:shd w:fill="1E3A8A"/>
-          </w:tcPr>
-          <w:p>
-            <w:r>
-              <w:rPr>
-                <w:b/>
-                <w:color w:val="FFFFFF"/>
-                <w:sz w:val="18"/>
-              </w:rPr>
-              <w:t>HÀNH ĐỘNG CỤ THỂ</w:t>
-            </w:r>
-          </w:p>
-        </w:tc>
-        <w:tc>
-          <w:tcPr>
-            <w:tcW w:type="dxa" w:w="2484"/>
-            <w:shd w:fill="1E3A8A"/>
-          </w:tcPr>
-          <w:p>
-            <w:r>
-              <w:rPr>
-                <w:b/>
-                <w:color w:val="FFFFFF"/>
-                <w:sz w:val="18"/>
-              </w:rPr>
-              <w:t>KẾT QUẢ ĐẦU RA</w:t>
-            </w:r>
-          </w:p>
-        </w:tc>
-      </w:tr>
-      <w:tr>
-        <w:tc>
-          <w:tcPr>
-            <w:tcW w:type="dxa" w:w="2484"/>
-            <w:shd w:fill="F1F5F9"/>
-            <w:tcMar>
-              <w:top w:w="60" w:type="dxa"/>
-              <w:bottom w:w="60" w:type="dxa"/>
-              <w:left w:w="80" w:type="dxa"/>
-              <w:right w:w="80" w:type="dxa"/>
-            </w:tcMar>
-          </w:tcPr>
-          <w:p>
-            <w:r>
-              <w:rPr>
-                <w:sz w:val="17"/>
-              </w:rPr>
-              <w:t>Pha 1: Thu thập</w:t>
-            </w:r>
-          </w:p>
-        </w:tc>
-        <w:tc>
-          <w:tcPr>
-            <w:tcW w:type="dxa" w:w="2484"/>
-            <w:shd w:fill="F1F5F9"/>
-            <w:tcMar>
-              <w:top w:w="60" w:type="dxa"/>
-              <w:bottom w:w="60" w:type="dxa"/>
-              <w:left w:w="80" w:type="dxa"/>
-              <w:right w:w="80" w:type="dxa"/>
-            </w:tcMar>
-          </w:tcPr>
-          <w:p>
-            <w:r>
-              <w:rPr>
-                <w:sz w:val="17"/>
-              </w:rPr>
-              <w:t>LÂM</w:t>
-              <w:br/>
-              <w:t>(Data Pipeline)</w:t>
-            </w:r>
-          </w:p>
-        </w:tc>
-        <w:tc>
-          <w:tcPr>
-            <w:tcW w:type="dxa" w:w="2484"/>
-            <w:shd w:fill="F1F5F9"/>
-            <w:tcMar>
-              <w:top w:w="60" w:type="dxa"/>
-              <w:bottom w:w="60" w:type="dxa"/>
-              <w:left w:w="80" w:type="dxa"/>
-              <w:right w:w="80" w:type="dxa"/>
-            </w:tcMar>
-          </w:tcPr>
-          <w:p>
-            <w:r>
-              <w:rPr>
-                <w:sz w:val="17"/>
-              </w:rPr>
-              <w:t>Tự động cào dữ liệu từ TheHackerNews, BleepingComputer, CISA KEV, GitHub PoC.</w:t>
-            </w:r>
-          </w:p>
-        </w:tc>
-        <w:tc>
-          <w:tcPr>
-            <w:tcW w:type="dxa" w:w="2484"/>
-            <w:shd w:fill="F1F5F9"/>
-            <w:tcMar>
-              <w:top w:w="60" w:type="dxa"/>
-              <w:bottom w:w="60" w:type="dxa"/>
-              <w:left w:w="80" w:type="dxa"/>
-              <w:right w:w="80" w:type="dxa"/>
-            </w:tcMar>
-          </w:tcPr>
-          <w:p>
-            <w:r>
-              <w:rPr>
-                <w:sz w:val="17"/>
-              </w:rPr>
-              <w:t>Dữ liệu báo cáo thô (RawThreatData)</w:t>
-            </w:r>
-          </w:p>
-        </w:tc>
-      </w:tr>
-      <w:tr>
-        <w:tc>
-          <w:tcPr>
-            <w:tcW w:type="dxa" w:w="2484"/>
-            <w:shd w:fill="FFFFFF"/>
-            <w:tcMar>
-              <w:top w:w="60" w:type="dxa"/>
-              <w:bottom w:w="60" w:type="dxa"/>
-              <w:left w:w="80" w:type="dxa"/>
-              <w:right w:w="80" w:type="dxa"/>
-            </w:tcMar>
-          </w:tcPr>
-          <w:p>
-            <w:r>
-              <w:rPr>
-                <w:sz w:val="17"/>
-              </w:rPr>
-              <w:t>Pha 2: Trích xuất</w:t>
-            </w:r>
-          </w:p>
-        </w:tc>
-        <w:tc>
-          <w:tcPr>
-            <w:tcW w:type="dxa" w:w="2484"/>
-            <w:shd w:fill="FFFFFF"/>
-            <w:tcMar>
-              <w:top w:w="60" w:type="dxa"/>
-              <w:bottom w:w="60" w:type="dxa"/>
-              <w:left w:w="80" w:type="dxa"/>
-              <w:right w:w="80" w:type="dxa"/>
-            </w:tcMar>
-          </w:tcPr>
-          <w:p>
-            <w:r>
-              <w:rPr>
-                <w:sz w:val="17"/>
-              </w:rPr>
-              <w:t>PHÚC</w:t>
-              <w:br/>
-              <w:t>(AI Core)</w:t>
-            </w:r>
-          </w:p>
-        </w:tc>
-        <w:tc>
-          <w:tcPr>
-            <w:tcW w:type="dxa" w:w="2484"/>
-            <w:shd w:fill="FFFFFF"/>
-            <w:tcMar>
-              <w:top w:w="60" w:type="dxa"/>
-              <w:bottom w:w="60" w:type="dxa"/>
-              <w:left w:w="80" w:type="dxa"/>
-              <w:right w:w="80" w:type="dxa"/>
-            </w:tcMar>
-          </w:tcPr>
-          <w:p>
-            <w:r>
-              <w:rPr>
-                <w:sz w:val="17"/>
-              </w:rPr>
-              <w:t>AI trích xuất thực thể IOC (IP, Domain, Hash, CVE) và ánh xạ MITRE ATT&amp;CK.</w:t>
-            </w:r>
-          </w:p>
-        </w:tc>
-        <w:tc>
-          <w:tcPr>
-            <w:tcW w:type="dxa" w:w="2484"/>
-            <w:shd w:fill="FFFFFF"/>
-            <w:tcMar>
-              <w:top w:w="60" w:type="dxa"/>
-              <w:bottom w:w="60" w:type="dxa"/>
-              <w:left w:w="80" w:type="dxa"/>
-              <w:right w:w="80" w:type="dxa"/>
-            </w:tcMar>
-          </w:tcPr>
-          <w:p>
-            <w:r>
-              <w:rPr>
-                <w:sz w:val="17"/>
-              </w:rPr>
-              <w:t>Danh sách ExtractedIOC &amp; MitreTechnique</w:t>
-            </w:r>
-          </w:p>
-        </w:tc>
-      </w:tr>
-      <w:tr>
-        <w:tc>
-          <w:tcPr>
-            <w:tcW w:type="dxa" w:w="2484"/>
-            <w:shd w:fill="F1F5F9"/>
-            <w:tcMar>
-              <w:top w:w="60" w:type="dxa"/>
-              <w:bottom w:w="60" w:type="dxa"/>
-              <w:left w:w="80" w:type="dxa"/>
-              <w:right w:w="80" w:type="dxa"/>
-            </w:tcMar>
-          </w:tcPr>
-          <w:p>
-            <w:r>
-              <w:rPr>
-                <w:sz w:val="17"/>
-              </w:rPr>
-              <w:t>Pha 3: Làm giàu</w:t>
-            </w:r>
-          </w:p>
-        </w:tc>
-        <w:tc>
-          <w:tcPr>
-            <w:tcW w:type="dxa" w:w="2484"/>
-            <w:shd w:fill="F1F5F9"/>
-            <w:tcMar>
-              <w:top w:w="60" w:type="dxa"/>
-              <w:bottom w:w="60" w:type="dxa"/>
-              <w:left w:w="80" w:type="dxa"/>
-              <w:right w:w="80" w:type="dxa"/>
-            </w:tcMar>
-          </w:tcPr>
-          <w:p>
-            <w:r>
-              <w:rPr>
-                <w:sz w:val="17"/>
-              </w:rPr>
-              <w:t>KHANG</w:t>
-              <w:br/>
-              <w:t>(Threat Intel)</w:t>
-            </w:r>
-          </w:p>
-        </w:tc>
-        <w:tc>
-          <w:tcPr>
-            <w:tcW w:type="dxa" w:w="2484"/>
-            <w:shd w:fill="F1F5F9"/>
-            <w:tcMar>
-              <w:top w:w="60" w:type="dxa"/>
-              <w:bottom w:w="60" w:type="dxa"/>
-              <w:left w:w="80" w:type="dxa"/>
-              <w:right w:w="80" w:type="dxa"/>
-            </w:tcMar>
-          </w:tcPr>
-          <w:p>
-            <w:r>
-              <w:rPr>
-                <w:sz w:val="17"/>
-              </w:rPr>
-              <w:t>Gọi VirusTotal, AbuseIPDB, Shodan API kiểm tra danh tiếng; chuẩn hóa STIX 2.1.</w:t>
-            </w:r>
-          </w:p>
-        </w:tc>
-        <w:tc>
-          <w:tcPr>
-            <w:tcW w:type="dxa" w:w="2484"/>
-            <w:shd w:fill="F1F5F9"/>
-            <w:tcMar>
-              <w:top w:w="60" w:type="dxa"/>
-              <w:bottom w:w="60" w:type="dxa"/>
-              <w:left w:w="80" w:type="dxa"/>
-              <w:right w:w="80" w:type="dxa"/>
-            </w:tcMar>
-          </w:tcPr>
-          <w:p>
-            <w:r>
-              <w:rPr>
-                <w:sz w:val="17"/>
-              </w:rPr>
-              <w:t>Dữ liệu làm giàu (EnrichedIOC) &amp; STIX Bundle</w:t>
-            </w:r>
-          </w:p>
-        </w:tc>
-      </w:tr>
-      <w:tr>
-        <w:tc>
-          <w:tcPr>
-            <w:tcW w:type="dxa" w:w="2484"/>
-            <w:shd w:fill="FFFFFF"/>
-            <w:tcMar>
-              <w:top w:w="60" w:type="dxa"/>
-              <w:bottom w:w="60" w:type="dxa"/>
-              <w:left w:w="80" w:type="dxa"/>
-              <w:right w:w="80" w:type="dxa"/>
-            </w:tcMar>
-          </w:tcPr>
-          <w:p>
-            <w:r>
-              <w:rPr>
-                <w:sz w:val="17"/>
-              </w:rPr>
-              <w:t>Pha 4: Phòng thủ</w:t>
-            </w:r>
-          </w:p>
-        </w:tc>
-        <w:tc>
-          <w:tcPr>
-            <w:tcW w:type="dxa" w:w="2484"/>
-            <w:shd w:fill="FFFFFF"/>
-            <w:tcMar>
-              <w:top w:w="60" w:type="dxa"/>
-              <w:bottom w:w="60" w:type="dxa"/>
-              <w:left w:w="80" w:type="dxa"/>
-              <w:right w:w="80" w:type="dxa"/>
-            </w:tcMar>
-          </w:tcPr>
-          <w:p>
-            <w:r>
-              <w:rPr>
-                <w:sz w:val="17"/>
-              </w:rPr>
-              <w:t>PHÚC &amp; LÂM</w:t>
-              <w:br/>
-              <w:t>(Rule &amp; Web)</w:t>
-            </w:r>
-          </w:p>
-        </w:tc>
-        <w:tc>
-          <w:tcPr>
-            <w:tcW w:type="dxa" w:w="2484"/>
-            <w:shd w:fill="FFFFFF"/>
-            <w:tcMar>
-              <w:top w:w="60" w:type="dxa"/>
-              <w:bottom w:w="60" w:type="dxa"/>
-              <w:left w:w="80" w:type="dxa"/>
-              <w:right w:w="80" w:type="dxa"/>
-            </w:tcMar>
-          </w:tcPr>
-          <w:p>
-            <w:r>
-              <w:rPr>
-                <w:sz w:val="17"/>
-              </w:rPr>
-              <w:t>AI sinh rule YARA/Sigma; Lâm hiển thị bản đồ trực quan lên Threat Intel Dashboard.</w:t>
-            </w:r>
-          </w:p>
-        </w:tc>
-        <w:tc>
-          <w:tcPr>
-            <w:tcW w:type="dxa" w:w="2484"/>
-            <w:shd w:fill="FFFFFF"/>
-            <w:tcMar>
-              <w:top w:w="60" w:type="dxa"/>
-              <w:bottom w:w="60" w:type="dxa"/>
-              <w:left w:w="80" w:type="dxa"/>
-              <w:right w:w="80" w:type="dxa"/>
-            </w:tcMar>
-          </w:tcPr>
-          <w:p>
-            <w:r>
-              <w:rPr>
-                <w:sz w:val="17"/>
-              </w:rPr>
-              <w:t>Dashboard trực quan &amp; Báo cáo Tình báo hoàn chỉnh</w:t>
-            </w:r>
-          </w:p>
-        </w:tc>
-      </w:tr>
-    </w:tbl>
-    <w:p>
-      <w:pPr>
-        <w:spacing w:after="120"/>
-      </w:pPr>
-    </w:p>
-    <w:p>
-      <w:pPr>
-        <w:spacing w:before="160" w:after="60"/>
-      </w:pPr>
-      <w:r>
-        <w:rPr>
-          <w:b/>
-          <w:color w:val="0066CC"/>
-          <w:sz w:val="21"/>
-        </w:rPr>
-        <w:t>Chi tiết các Tác tử AI bên trong đồ thị LangGraph (Phúc phụ trách):</w:t>
-      </w:r>
-    </w:p>
-    <w:tbl>
-      <w:tblPr>
-        <w:tblW w:type="auto" w:w="0"/>
-        <w:jc w:val="center"/>
-        <w:tblLook w:firstColumn="1" w:firstRow="1" w:lastColumn="0" w:lastRow="0" w:noHBand="0" w:noVBand="1" w:val="04A0"/>
-      </w:tblPr>
-      <w:tblGrid>
-        <w:gridCol w:w="3312"/>
-        <w:gridCol w:w="3312"/>
-        <w:gridCol w:w="3312"/>
-      </w:tblGrid>
-      <w:tr>
-        <w:tc>
-          <w:tcPr>
-            <w:tcW w:type="dxa" w:w="3312"/>
-            <w:shd w:fill="4338CA"/>
-          </w:tcPr>
-          <w:p>
-            <w:r>
-              <w:rPr>
-                <w:b/>
-                <w:color w:val="FFFFFF"/>
-                <w:sz w:val="18"/>
-              </w:rPr>
-              <w:t>TÁC TỬ (AGENT)</w:t>
-            </w:r>
-          </w:p>
-        </w:tc>
-        <w:tc>
-          <w:tcPr>
-            <w:tcW w:type="dxa" w:w="3312"/>
-            <w:shd w:fill="4338CA"/>
-          </w:tcPr>
-          <w:p>
-            <w:r>
-              <w:rPr>
-                <w:b/>
-                <w:color w:val="FFFFFF"/>
-                <w:sz w:val="18"/>
-              </w:rPr>
-              <w:t>NHIỆM VỤ CHUYÊN TRÁCH</w:t>
-            </w:r>
-          </w:p>
-        </w:tc>
-        <w:tc>
-          <w:tcPr>
-            <w:tcW w:type="dxa" w:w="3312"/>
-            <w:shd w:fill="4338CA"/>
-          </w:tcPr>
-          <w:p>
-            <w:r>
-              <w:rPr>
-                <w:b/>
-                <w:color w:val="FFFFFF"/>
-                <w:sz w:val="18"/>
-              </w:rPr>
-              <w:t>ĐẦU RA CỤ THỂ</w:t>
-            </w:r>
-          </w:p>
-        </w:tc>
-      </w:tr>
-      <w:tr>
-        <w:tc>
-          <w:tcPr>
-            <w:tcW w:type="dxa" w:w="3312"/>
-            <w:shd w:fill="EEF2FF"/>
-            <w:tcMar>
-              <w:top w:w="60" w:type="dxa"/>
-              <w:bottom w:w="60" w:type="dxa"/>
-              <w:left w:w="80" w:type="dxa"/>
-              <w:right w:w="80" w:type="dxa"/>
-            </w:tcMar>
-          </w:tcPr>
-          <w:p>
-            <w:r>
-              <w:rPr>
-                <w:sz w:val="17"/>
-              </w:rPr>
-              <w:t>1. IOC Extractor Agent</w:t>
-            </w:r>
-          </w:p>
-        </w:tc>
-        <w:tc>
-          <w:tcPr>
-            <w:tcW w:type="dxa" w:w="3312"/>
-            <w:shd w:fill="EEF2FF"/>
-            <w:tcMar>
-              <w:top w:w="60" w:type="dxa"/>
-              <w:bottom w:w="60" w:type="dxa"/>
-              <w:left w:w="80" w:type="dxa"/>
-              <w:right w:w="80" w:type="dxa"/>
-            </w:tcMar>
-          </w:tcPr>
-          <w:p>
-            <w:r>
-              <w:rPr>
-                <w:sz w:val="17"/>
-              </w:rPr>
-              <w:t>Đọc văn bản bài viết, bóc tách chính xác các IP, Domain, Hash, CVE, APT groups.</w:t>
-            </w:r>
-          </w:p>
-        </w:tc>
-        <w:tc>
-          <w:tcPr>
-            <w:tcW w:type="dxa" w:w="3312"/>
-            <w:shd w:fill="EEF2FF"/>
-            <w:tcMar>
-              <w:top w:w="60" w:type="dxa"/>
-              <w:bottom w:w="60" w:type="dxa"/>
-              <w:left w:w="80" w:type="dxa"/>
-              <w:right w:w="80" w:type="dxa"/>
-            </w:tcMar>
-          </w:tcPr>
-          <w:p>
-            <w:r>
-              <w:rPr>
-                <w:sz w:val="17"/>
-              </w:rPr>
-              <w:t>JSON danh sách IOC kèm câu văn bản ngữ cảnh.</w:t>
-            </w:r>
-          </w:p>
-        </w:tc>
-      </w:tr>
-      <w:tr>
-        <w:tc>
-          <w:tcPr>
-            <w:tcW w:type="dxa" w:w="3312"/>
-            <w:shd w:fill="FFFFFF"/>
-            <w:tcMar>
-              <w:top w:w="60" w:type="dxa"/>
-              <w:bottom w:w="60" w:type="dxa"/>
-              <w:left w:w="80" w:type="dxa"/>
-              <w:right w:w="80" w:type="dxa"/>
-            </w:tcMar>
-          </w:tcPr>
-          <w:p>
-            <w:r>
-              <w:rPr>
-                <w:sz w:val="17"/>
-              </w:rPr>
-              <w:t>2. MITRE ATT&amp;CK Mapper Agent</w:t>
-            </w:r>
-          </w:p>
-        </w:tc>
-        <w:tc>
-          <w:tcPr>
-            <w:tcW w:type="dxa" w:w="3312"/>
-            <w:shd w:fill="FFFFFF"/>
-            <w:tcMar>
-              <w:top w:w="60" w:type="dxa"/>
-              <w:bottom w:w="60" w:type="dxa"/>
-              <w:left w:w="80" w:type="dxa"/>
-              <w:right w:w="80" w:type="dxa"/>
-            </w:tcMar>
-          </w:tcPr>
-          <w:p>
-            <w:r>
-              <w:rPr>
-                <w:sz w:val="17"/>
-              </w:rPr>
-              <w:t>Phân tích hành vi mô tả (ví dụ lừa đảo qua email, chạy PowerShell ngầm) sang mã kỹ thuật T-code.</w:t>
-            </w:r>
-          </w:p>
-        </w:tc>
-        <w:tc>
-          <w:tcPr>
-            <w:tcW w:type="dxa" w:w="3312"/>
-            <w:shd w:fill="FFFFFF"/>
-            <w:tcMar>
-              <w:top w:w="60" w:type="dxa"/>
-              <w:bottom w:w="60" w:type="dxa"/>
-              <w:left w:w="80" w:type="dxa"/>
-              <w:right w:w="80" w:type="dxa"/>
-            </w:tcMar>
-          </w:tcPr>
-          <w:p>
-            <w:r>
-              <w:rPr>
-                <w:sz w:val="17"/>
-              </w:rPr>
-              <w:t>Ma trận kỹ thuật MITRE ATT&amp;CK (T1566, T1059...).</w:t>
-            </w:r>
-          </w:p>
-        </w:tc>
-      </w:tr>
-      <w:tr>
-        <w:tc>
-          <w:tcPr>
-            <w:tcW w:type="dxa" w:w="3312"/>
-            <w:shd w:fill="EEF2FF"/>
-            <w:tcMar>
-              <w:top w:w="60" w:type="dxa"/>
-              <w:bottom w:w="60" w:type="dxa"/>
-              <w:left w:w="80" w:type="dxa"/>
-              <w:right w:w="80" w:type="dxa"/>
-            </w:tcMar>
-          </w:tcPr>
-          <w:p>
-            <w:r>
-              <w:rPr>
-                <w:sz w:val="17"/>
-              </w:rPr>
-              <w:t>3. Defensive Rule Generator</w:t>
-            </w:r>
-          </w:p>
-        </w:tc>
-        <w:tc>
-          <w:tcPr>
-            <w:tcW w:type="dxa" w:w="3312"/>
-            <w:shd w:fill="EEF2FF"/>
-            <w:tcMar>
-              <w:top w:w="60" w:type="dxa"/>
-              <w:bottom w:w="60" w:type="dxa"/>
-              <w:left w:w="80" w:type="dxa"/>
-              <w:right w:w="80" w:type="dxa"/>
-            </w:tcMar>
-          </w:tcPr>
-          <w:p>
-            <w:r>
-              <w:rPr>
-                <w:sz w:val="17"/>
-              </w:rPr>
-              <w:t>Dựa trên IOC và kỹ thuật tấn công, tự động viết mã quy tắc phòng thủ.</w:t>
-            </w:r>
-          </w:p>
-        </w:tc>
-        <w:tc>
-          <w:tcPr>
-            <w:tcW w:type="dxa" w:w="3312"/>
-            <w:shd w:fill="EEF2FF"/>
-            <w:tcMar>
-              <w:top w:w="60" w:type="dxa"/>
-              <w:bottom w:w="60" w:type="dxa"/>
-              <w:left w:w="80" w:type="dxa"/>
-              <w:right w:w="80" w:type="dxa"/>
-            </w:tcMar>
-          </w:tcPr>
-          <w:p>
-            <w:r>
-              <w:rPr>
-                <w:sz w:val="17"/>
-              </w:rPr>
-              <w:t>File Sigma Rule cho SIEM và file YARA Rule cho Endpoint.</w:t>
-            </w:r>
-          </w:p>
-        </w:tc>
-      </w:tr>
-    </w:tbl>
-    <w:p>
-      <w:r>
-        <w:br w:type="page"/>
-      </w:r>
-    </w:p>
-    <w:p>
-      <w:pPr>
-        <w:spacing w:before="240" w:after="80"/>
-      </w:pPr>
-      <w:r>
-        <w:rPr>
-          <w:b/>
-          <w:color w:val="102C57"/>
-          <w:sz w:val="25"/>
-        </w:rPr>
-        <w:t>3. MA TRẬN PHÂN CÔNG NHIỆM VỤ CHO 3 THÀNH VIÊN</w:t>
+        <w:t>1. MA TRẬN PHÂN CÔNG VAI TRÒ 3 THÀNH VIÊN TRONG 8 TUẦN</w:t>
       </w:r>
     </w:p>
     <w:tbl>
@@ -1109,7 +261,7 @@
                 <w:color w:val="FFFFFF"/>
                 <w:sz w:val="18"/>
               </w:rPr>
-              <w:t>CÔNG VIỆC TRỌNG TÂM</w:t>
+              <w:t>TRỌNG TÂM CÔNG VIỆC (8 TUẦN)</w:t>
             </w:r>
           </w:p>
         </w:tc>
@@ -1125,7 +277,7 @@
                 <w:color w:val="FFFFFF"/>
                 <w:sz w:val="18"/>
               </w:rPr>
-              <w:t>CÔNG NGHỆ DỰ KIẾN</w:t>
+              <w:t>CÔNG NGHỆ CHÍNH</w:t>
             </w:r>
           </w:p>
         </w:tc>
@@ -1136,10 +288,10 @@
             <w:tcW w:type="dxa" w:w="2484"/>
             <w:shd w:fill="ECFDF5"/>
             <w:tcMar>
-              <w:top w:w="60" w:type="dxa"/>
-              <w:bottom w:w="60" w:type="dxa"/>
-              <w:left w:w="80" w:type="dxa"/>
-              <w:right w:w="80" w:type="dxa"/>
+              <w:top w:w="50" w:type="dxa"/>
+              <w:bottom w:w="50" w:type="dxa"/>
+              <w:left w:w="70" w:type="dxa"/>
+              <w:right w:w="70" w:type="dxa"/>
             </w:tcMar>
           </w:tcPr>
           <w:p>
@@ -1158,10 +310,10 @@
             <w:tcW w:type="dxa" w:w="2484"/>
             <w:shd w:fill="ECFDF5"/>
             <w:tcMar>
-              <w:top w:w="60" w:type="dxa"/>
-              <w:bottom w:w="60" w:type="dxa"/>
-              <w:left w:w="80" w:type="dxa"/>
-              <w:right w:w="80" w:type="dxa"/>
+              <w:top w:w="50" w:type="dxa"/>
+              <w:bottom w:w="50" w:type="dxa"/>
+              <w:left w:w="70" w:type="dxa"/>
+              <w:right w:w="70" w:type="dxa"/>
             </w:tcMar>
           </w:tcPr>
           <w:p>
@@ -1180,10 +332,10 @@
             <w:tcW w:type="dxa" w:w="2484"/>
             <w:shd w:fill="ECFDF5"/>
             <w:tcMar>
-              <w:top w:w="60" w:type="dxa"/>
-              <w:bottom w:w="60" w:type="dxa"/>
-              <w:left w:w="80" w:type="dxa"/>
-              <w:right w:w="80" w:type="dxa"/>
+              <w:top w:w="50" w:type="dxa"/>
+              <w:bottom w:w="50" w:type="dxa"/>
+              <w:left w:w="70" w:type="dxa"/>
+              <w:right w:w="70" w:type="dxa"/>
             </w:tcMar>
           </w:tcPr>
           <w:p>
@@ -1191,15 +343,13 @@
               <w:rPr>
                 <w:sz w:val="17"/>
               </w:rPr>
-              <w:t>• Thiết kế LangGraph StateGraph điều phối luồng CTI.</w:t>
+              <w:t>• Tuần 1-2: Xây dựng LangGraph StateGraph, Prompt bóc tách IOCs.</w:t>
               <w:br/>
-              <w:t>• Viết Prompt trích xuất IOCs từ văn bản phi cấu trúc.</w:t>
+              <w:t>• Tuần 3-4: Xây dựng Prompt ánh xạ MITRE ATT&amp;CK và sinh Sigma/YARA rules.</w:t>
               <w:br/>
-              <w:t>• Viết Prompt ánh xạ ma trận MITRE ATT&amp;CK.</w:t>
+              <w:t>• Tuần 5-6: Tối ưu đồ thị Agent, xử lý rate limit và ngoại lệ.</w:t>
               <w:br/>
-              <w:t>• Viết Prompt sinh quy tắc phòng thủ (Sigma/YARA rules).</w:t>
-              <w:br/>
-              <w:t>• Chủ trì viết báo cáo phần Kiến trúc AI.</w:t>
+              <w:t>• Tuần 7-8: Chủ trì viết Chương 2 &amp; 3 báo cáo, làm slide thuyết trình.</w:t>
             </w:r>
           </w:p>
         </w:tc>
@@ -1208,10 +358,10 @@
             <w:tcW w:type="dxa" w:w="2484"/>
             <w:shd w:fill="ECFDF5"/>
             <w:tcMar>
-              <w:top w:w="60" w:type="dxa"/>
-              <w:bottom w:w="60" w:type="dxa"/>
-              <w:left w:w="80" w:type="dxa"/>
-              <w:right w:w="80" w:type="dxa"/>
+              <w:top w:w="50" w:type="dxa"/>
+              <w:bottom w:w="50" w:type="dxa"/>
+              <w:left w:w="70" w:type="dxa"/>
+              <w:right w:w="70" w:type="dxa"/>
             </w:tcMar>
           </w:tcPr>
           <w:p>
@@ -1221,7 +371,7 @@
               </w:rPr>
               <w:t>Python 3.11</w:t>
               <w:br/>
-              <w:t>LangGraph / LangChain</w:t>
+              <w:t>LangGraph</w:t>
               <w:br/>
               <w:t>DeepSeek / Qwen 2.5</w:t>
               <w:br/>
@@ -1236,10 +386,10 @@
             <w:tcW w:type="dxa" w:w="2484"/>
             <w:shd w:fill="FFFFFF"/>
             <w:tcMar>
-              <w:top w:w="60" w:type="dxa"/>
-              <w:bottom w:w="60" w:type="dxa"/>
-              <w:left w:w="80" w:type="dxa"/>
-              <w:right w:w="80" w:type="dxa"/>
+              <w:top w:w="50" w:type="dxa"/>
+              <w:bottom w:w="50" w:type="dxa"/>
+              <w:left w:w="70" w:type="dxa"/>
+              <w:right w:w="70" w:type="dxa"/>
             </w:tcMar>
           </w:tcPr>
           <w:p>
@@ -1256,10 +406,10 @@
             <w:tcW w:type="dxa" w:w="2484"/>
             <w:shd w:fill="FFFFFF"/>
             <w:tcMar>
-              <w:top w:w="60" w:type="dxa"/>
-              <w:bottom w:w="60" w:type="dxa"/>
-              <w:left w:w="80" w:type="dxa"/>
-              <w:right w:w="80" w:type="dxa"/>
+              <w:top w:w="50" w:type="dxa"/>
+              <w:bottom w:w="50" w:type="dxa"/>
+              <w:left w:w="70" w:type="dxa"/>
+              <w:right w:w="70" w:type="dxa"/>
             </w:tcMar>
           </w:tcPr>
           <w:p>
@@ -1278,10 +428,10 @@
             <w:tcW w:type="dxa" w:w="2484"/>
             <w:shd w:fill="FFFFFF"/>
             <w:tcMar>
-              <w:top w:w="60" w:type="dxa"/>
-              <w:bottom w:w="60" w:type="dxa"/>
-              <w:left w:w="80" w:type="dxa"/>
-              <w:right w:w="80" w:type="dxa"/>
+              <w:top w:w="50" w:type="dxa"/>
+              <w:bottom w:w="50" w:type="dxa"/>
+              <w:left w:w="70" w:type="dxa"/>
+              <w:right w:w="70" w:type="dxa"/>
             </w:tcMar>
           </w:tcPr>
           <w:p>
@@ -1289,13 +439,13 @@
               <w:rPr>
                 <w:sz w:val="17"/>
               </w:rPr>
-              <w:t>• Tích hợp API VirusTotal, AbuseIPDB, Shodan.</w:t>
+              <w:t>• Tuần 1-2: Cấu hình API VirusTotal, AbuseIPDB, Shodan.</w:t>
               <w:br/>
-              <w:t>• Xây dựng bộ chuyển đổi dữ liệu sang chuẩn STIX 2.1 / MISP.</w:t>
+              <w:t>• Tuần 3-4: Xây dựng Module làm giàu dữ liệu &amp; xuất chuẩn STIX 2.1.</w:t>
               <w:br/>
-              <w:t>• Thu thập bộ Dataset 50-100 báo cáo APT thực tế (Mandiant, CISA, Kaspersky).</w:t>
+              <w:t>• Tuần 5-6: Chuẩn bị Dataset 50 báo cáo APT thực tế (Ground Truth).</w:t>
               <w:br/>
-              <w:t>• Đo đạc chỉ số khoa học: Precision, Recall, F1-Score của việc bóc tách IOC.</w:t>
+              <w:t>• Tuần 7-8: Chạy đo đạc Precision, Recall; viết Chương 1 &amp; 4 báo cáo.</w:t>
             </w:r>
           </w:p>
         </w:tc>
@@ -1304,10 +454,10 @@
             <w:tcW w:type="dxa" w:w="2484"/>
             <w:shd w:fill="FFFFFF"/>
             <w:tcMar>
-              <w:top w:w="60" w:type="dxa"/>
-              <w:bottom w:w="60" w:type="dxa"/>
-              <w:left w:w="80" w:type="dxa"/>
-              <w:right w:w="80" w:type="dxa"/>
+              <w:top w:w="50" w:type="dxa"/>
+              <w:bottom w:w="50" w:type="dxa"/>
+              <w:left w:w="70" w:type="dxa"/>
+              <w:right w:w="70" w:type="dxa"/>
             </w:tcMar>
           </w:tcPr>
           <w:p>
@@ -1319,7 +469,7 @@
               <w:br/>
               <w:t>AbuseIPDB API</w:t>
               <w:br/>
-              <w:t>STIX 2.1 Python SDK</w:t>
+              <w:t>STIX 2.1 SDK</w:t>
               <w:br/>
               <w:t>Pandas / Matplotlib</w:t>
             </w:r>
@@ -1332,10 +482,10 @@
             <w:tcW w:type="dxa" w:w="2484"/>
             <w:shd w:fill="ECFDF5"/>
             <w:tcMar>
-              <w:top w:w="60" w:type="dxa"/>
-              <w:bottom w:w="60" w:type="dxa"/>
-              <w:left w:w="80" w:type="dxa"/>
-              <w:right w:w="80" w:type="dxa"/>
+              <w:top w:w="50" w:type="dxa"/>
+              <w:bottom w:w="50" w:type="dxa"/>
+              <w:left w:w="70" w:type="dxa"/>
+              <w:right w:w="70" w:type="dxa"/>
             </w:tcMar>
           </w:tcPr>
           <w:p>
@@ -1352,10 +502,10 @@
             <w:tcW w:type="dxa" w:w="2484"/>
             <w:shd w:fill="ECFDF5"/>
             <w:tcMar>
-              <w:top w:w="60" w:type="dxa"/>
-              <w:bottom w:w="60" w:type="dxa"/>
-              <w:left w:w="80" w:type="dxa"/>
-              <w:right w:w="80" w:type="dxa"/>
+              <w:top w:w="50" w:type="dxa"/>
+              <w:bottom w:w="50" w:type="dxa"/>
+              <w:left w:w="70" w:type="dxa"/>
+              <w:right w:w="70" w:type="dxa"/>
             </w:tcMar>
           </w:tcPr>
           <w:p>
@@ -1374,10 +524,10 @@
             <w:tcW w:type="dxa" w:w="2484"/>
             <w:shd w:fill="ECFDF5"/>
             <w:tcMar>
-              <w:top w:w="60" w:type="dxa"/>
-              <w:bottom w:w="60" w:type="dxa"/>
-              <w:left w:w="80" w:type="dxa"/>
-              <w:right w:w="80" w:type="dxa"/>
+              <w:top w:w="50" w:type="dxa"/>
+              <w:bottom w:w="50" w:type="dxa"/>
+              <w:left w:w="70" w:type="dxa"/>
+              <w:right w:w="70" w:type="dxa"/>
             </w:tcMar>
           </w:tcPr>
           <w:p>
@@ -1385,15 +535,13 @@
               <w:rPr>
                 <w:sz w:val="17"/>
               </w:rPr>
-              <w:t>• Xây dựng Engine tự động cào tin RSS, CISA KEV, GitHub PoC.</w:t>
+              <w:t>• Tuần 1-2: Viết Collector tự động cào tin RSS, CISA KEV, GitHub.</w:t>
               <w:br/>
-              <w:t>• Xây dựng FastAPI Backend quản lý hàng đợi và lưu trữ CTI.</w:t>
+              <w:t>• Tuần 3-4: Xây dựng FastAPI Backend quản lý hàng đợi phân tích và SQLite.</w:t>
               <w:br/>
-              <w:t>• Phát triển Web Threat Intel Dashboard trực quan hóa IOC &amp; MITRE.</w:t>
+              <w:t>• Tuần 5-6: Phát triển Web Dashboard trực quan hóa IOC &amp; ma trận MITRE.</w:t>
               <w:br/>
-              <w:t>• Đóng gói toàn bộ hệ thống bằng Docker Compose.</w:t>
-              <w:br/>
-              <w:t>• Phụ trách CI/CD và video demo bảo vệ.</w:t>
+              <w:t>• Tuần 7-8: Đóng gói Docker Compose, quay video demo 3 phút, làm slide.</w:t>
             </w:r>
           </w:p>
         </w:tc>
@@ -1402,10 +550,10 @@
             <w:tcW w:type="dxa" w:w="2484"/>
             <w:shd w:fill="ECFDF5"/>
             <w:tcMar>
-              <w:top w:w="60" w:type="dxa"/>
-              <w:bottom w:w="60" w:type="dxa"/>
-              <w:left w:w="80" w:type="dxa"/>
-              <w:right w:w="80" w:type="dxa"/>
+              <w:top w:w="50" w:type="dxa"/>
+              <w:bottom w:w="50" w:type="dxa"/>
+              <w:left w:w="70" w:type="dxa"/>
+              <w:right w:w="70" w:type="dxa"/>
             </w:tcMar>
           </w:tcPr>
           <w:p>
@@ -1415,11 +563,9 @@
               </w:rPr>
               <w:t>FastAPI / Uvicorn</w:t>
               <w:br/>
-              <w:t>BeautifulSoup / Feedparser</w:t>
+              <w:t>BeautifulSoup4</w:t>
               <w:br/>
               <w:t>Next.js / TailwindCSS</w:t>
-              <w:br/>
-              <w:t>Cytoscape.js (Graph UI)</w:t>
               <w:br/>
               <w:t>Docker Compose</w:t>
             </w:r>
@@ -1442,414 +588,7 @@
           <w:color w:val="102C57"/>
           <w:sz w:val="25"/>
         </w:rPr>
-        <w:t>4. BỘ CHỈ SỐ ĐO LƯỜNG KHOA HỌC &amp; KỊCH BẢN BẢO VỆ</w:t>
-      </w:r>
-    </w:p>
-    <w:p>
-      <w:r>
-        <w:t>Để đạt điểm 9.5 - 10 trước hội đồng, nhóm chứng minh bằng 4 chỉ số khoa học thực nghiệm:</w:t>
-      </w:r>
-    </w:p>
-    <w:tbl>
-      <w:tblPr>
-        <w:tblW w:type="auto" w:w="0"/>
-        <w:jc w:val="center"/>
-        <w:tblLook w:firstColumn="1" w:firstRow="1" w:lastColumn="0" w:lastRow="0" w:noHBand="0" w:noVBand="1" w:val="04A0"/>
-      </w:tblPr>
-      <w:tblGrid>
-        <w:gridCol w:w="3312"/>
-        <w:gridCol w:w="3312"/>
-        <w:gridCol w:w="3312"/>
-      </w:tblGrid>
-      <w:tr>
-        <w:tc>
-          <w:tcPr>
-            <w:tcW w:type="dxa" w:w="3312"/>
-            <w:shd w:fill="6D28D9"/>
-          </w:tcPr>
-          <w:p>
-            <w:r>
-              <w:rPr>
-                <w:b/>
-                <w:color w:val="FFFFFF"/>
-                <w:sz w:val="18"/>
-              </w:rPr>
-              <w:t>CHỈ SỐ ĐO LƯỜNG</w:t>
-            </w:r>
-          </w:p>
-        </w:tc>
-        <w:tc>
-          <w:tcPr>
-            <w:tcW w:type="dxa" w:w="3312"/>
-            <w:shd w:fill="6D28D9"/>
-          </w:tcPr>
-          <w:p>
-            <w:r>
-              <w:rPr>
-                <w:b/>
-                <w:color w:val="FFFFFF"/>
-                <w:sz w:val="18"/>
-              </w:rPr>
-              <w:t>Ý NGHĨA KHOA HỌC</w:t>
-            </w:r>
-          </w:p>
-        </w:tc>
-        <w:tc>
-          <w:tcPr>
-            <w:tcW w:type="dxa" w:w="3312"/>
-            <w:shd w:fill="6D28D9"/>
-          </w:tcPr>
-          <w:p>
-            <w:r>
-              <w:rPr>
-                <w:b/>
-                <w:color w:val="FFFFFF"/>
-                <w:sz w:val="18"/>
-              </w:rPr>
-              <w:t>MỤC TIÊU ĐẠT ĐƯỢC</w:t>
-            </w:r>
-          </w:p>
-        </w:tc>
-      </w:tr>
-      <w:tr>
-        <w:tc>
-          <w:tcPr>
-            <w:tcW w:type="dxa" w:w="3312"/>
-            <w:shd w:fill="F5F3FF"/>
-            <w:tcMar>
-              <w:top w:w="60" w:type="dxa"/>
-              <w:bottom w:w="60" w:type="dxa"/>
-              <w:left w:w="80" w:type="dxa"/>
-              <w:right w:w="80" w:type="dxa"/>
-            </w:tcMar>
-          </w:tcPr>
-          <w:p>
-            <w:r>
-              <w:rPr>
-                <w:sz w:val="17"/>
-              </w:rPr>
-              <w:t>Precision (Trích xuất IOC)</w:t>
-            </w:r>
-          </w:p>
-        </w:tc>
-        <w:tc>
-          <w:tcPr>
-            <w:tcW w:type="dxa" w:w="3312"/>
-            <w:shd w:fill="F5F3FF"/>
-            <w:tcMar>
-              <w:top w:w="60" w:type="dxa"/>
-              <w:bottom w:w="60" w:type="dxa"/>
-              <w:left w:w="80" w:type="dxa"/>
-              <w:right w:w="80" w:type="dxa"/>
-            </w:tcMar>
-          </w:tcPr>
-          <w:p>
-            <w:r>
-              <w:rPr>
-                <w:sz w:val="17"/>
-              </w:rPr>
-              <w:t>Trong các chuỗi ký tự AI bóc tách ra là IOC, có bao nhiêu % là IOC thật?</w:t>
-            </w:r>
-          </w:p>
-        </w:tc>
-        <w:tc>
-          <w:tcPr>
-            <w:tcW w:type="dxa" w:w="3312"/>
-            <w:shd w:fill="F5F3FF"/>
-            <w:tcMar>
-              <w:top w:w="60" w:type="dxa"/>
-              <w:bottom w:w="60" w:type="dxa"/>
-              <w:left w:w="80" w:type="dxa"/>
-              <w:right w:w="80" w:type="dxa"/>
-            </w:tcMar>
-          </w:tcPr>
-          <w:p>
-            <w:r>
-              <w:rPr>
-                <w:sz w:val="17"/>
-              </w:rPr>
-              <w:t>Đạt &gt; 92% (Không bị nhầm lẫn giữa chuỗi text thường và hash/IP)</w:t>
-            </w:r>
-          </w:p>
-        </w:tc>
-      </w:tr>
-      <w:tr>
-        <w:tc>
-          <w:tcPr>
-            <w:tcW w:type="dxa" w:w="3312"/>
-            <w:shd w:fill="FFFFFF"/>
-            <w:tcMar>
-              <w:top w:w="60" w:type="dxa"/>
-              <w:bottom w:w="60" w:type="dxa"/>
-              <w:left w:w="80" w:type="dxa"/>
-              <w:right w:w="80" w:type="dxa"/>
-            </w:tcMar>
-          </w:tcPr>
-          <w:p>
-            <w:r>
-              <w:rPr>
-                <w:sz w:val="17"/>
-              </w:rPr>
-              <w:t>Recall (Độ bao phủ IOC)</w:t>
-            </w:r>
-          </w:p>
-        </w:tc>
-        <w:tc>
-          <w:tcPr>
-            <w:tcW w:type="dxa" w:w="3312"/>
-            <w:shd w:fill="FFFFFF"/>
-            <w:tcMar>
-              <w:top w:w="60" w:type="dxa"/>
-              <w:bottom w:w="60" w:type="dxa"/>
-              <w:left w:w="80" w:type="dxa"/>
-              <w:right w:w="80" w:type="dxa"/>
-            </w:tcMar>
-          </w:tcPr>
-          <w:p>
-            <w:r>
-              <w:rPr>
-                <w:sz w:val="17"/>
-              </w:rPr>
-              <w:t>Trong tổng số IOC có trong báo cáo, AI bắt được bao nhiêu %?</w:t>
-            </w:r>
-          </w:p>
-        </w:tc>
-        <w:tc>
-          <w:tcPr>
-            <w:tcW w:type="dxa" w:w="3312"/>
-            <w:shd w:fill="FFFFFF"/>
-            <w:tcMar>
-              <w:top w:w="60" w:type="dxa"/>
-              <w:bottom w:w="60" w:type="dxa"/>
-              <w:left w:w="80" w:type="dxa"/>
-              <w:right w:w="80" w:type="dxa"/>
-            </w:tcMar>
-          </w:tcPr>
-          <w:p>
-            <w:r>
-              <w:rPr>
-                <w:sz w:val="17"/>
-              </w:rPr>
-              <w:t>Đạt &gt; 88% (Không bỏ sót các domain/IP nguy hiểm)</w:t>
-            </w:r>
-          </w:p>
-        </w:tc>
-      </w:tr>
-      <w:tr>
-        <w:tc>
-          <w:tcPr>
-            <w:tcW w:type="dxa" w:w="3312"/>
-            <w:shd w:fill="F5F3FF"/>
-            <w:tcMar>
-              <w:top w:w="60" w:type="dxa"/>
-              <w:bottom w:w="60" w:type="dxa"/>
-              <w:left w:w="80" w:type="dxa"/>
-              <w:right w:w="80" w:type="dxa"/>
-            </w:tcMar>
-          </w:tcPr>
-          <w:p>
-            <w:r>
-              <w:rPr>
-                <w:sz w:val="17"/>
-              </w:rPr>
-              <w:t>MITRE Mapping Accuracy</w:t>
-            </w:r>
-          </w:p>
-        </w:tc>
-        <w:tc>
-          <w:tcPr>
-            <w:tcW w:type="dxa" w:w="3312"/>
-            <w:shd w:fill="F5F3FF"/>
-            <w:tcMar>
-              <w:top w:w="60" w:type="dxa"/>
-              <w:bottom w:w="60" w:type="dxa"/>
-              <w:left w:w="80" w:type="dxa"/>
-              <w:right w:w="80" w:type="dxa"/>
-            </w:tcMar>
-          </w:tcPr>
-          <w:p>
-            <w:r>
-              <w:rPr>
-                <w:sz w:val="17"/>
-              </w:rPr>
-              <w:t>Độ chính xác khi AI ánh xạ hành vi sang kỹ thuật MITRE ATT&amp;CK so với chuyên gia.</w:t>
-            </w:r>
-          </w:p>
-        </w:tc>
-        <w:tc>
-          <w:tcPr>
-            <w:tcW w:type="dxa" w:w="3312"/>
-            <w:shd w:fill="F5F3FF"/>
-            <w:tcMar>
-              <w:top w:w="60" w:type="dxa"/>
-              <w:bottom w:w="60" w:type="dxa"/>
-              <w:left w:w="80" w:type="dxa"/>
-              <w:right w:w="80" w:type="dxa"/>
-            </w:tcMar>
-          </w:tcPr>
-          <w:p>
-            <w:r>
-              <w:rPr>
-                <w:sz w:val="17"/>
-              </w:rPr>
-              <w:t>Đạt &gt; 85% khớp với nhãn chuẩn</w:t>
-            </w:r>
-          </w:p>
-        </w:tc>
-      </w:tr>
-      <w:tr>
-        <w:tc>
-          <w:tcPr>
-            <w:tcW w:type="dxa" w:w="3312"/>
-            <w:shd w:fill="FFFFFF"/>
-            <w:tcMar>
-              <w:top w:w="60" w:type="dxa"/>
-              <w:bottom w:w="60" w:type="dxa"/>
-              <w:left w:w="80" w:type="dxa"/>
-              <w:right w:w="80" w:type="dxa"/>
-            </w:tcMar>
-          </w:tcPr>
-          <w:p>
-            <w:r>
-              <w:rPr>
-                <w:sz w:val="17"/>
-              </w:rPr>
-              <w:t>Thời gian xử lý tự động</w:t>
-            </w:r>
-          </w:p>
-        </w:tc>
-        <w:tc>
-          <w:tcPr>
-            <w:tcW w:type="dxa" w:w="3312"/>
-            <w:shd w:fill="FFFFFF"/>
-            <w:tcMar>
-              <w:top w:w="60" w:type="dxa"/>
-              <w:bottom w:w="60" w:type="dxa"/>
-              <w:left w:w="80" w:type="dxa"/>
-              <w:right w:w="80" w:type="dxa"/>
-            </w:tcMar>
-          </w:tcPr>
-          <w:p>
-            <w:r>
-              <w:rPr>
-                <w:sz w:val="17"/>
-              </w:rPr>
-              <w:t>Thời gian từ lúc nhận bài báo đến lúc xuất báo cáo tình báo và rule Sigma/YARA.</w:t>
-            </w:r>
-          </w:p>
-        </w:tc>
-        <w:tc>
-          <w:tcPr>
-            <w:tcW w:type="dxa" w:w="3312"/>
-            <w:shd w:fill="FFFFFF"/>
-            <w:tcMar>
-              <w:top w:w="60" w:type="dxa"/>
-              <w:bottom w:w="60" w:type="dxa"/>
-              <w:left w:w="80" w:type="dxa"/>
-              <w:right w:w="80" w:type="dxa"/>
-            </w:tcMar>
-          </w:tcPr>
-          <w:p>
-            <w:r>
-              <w:rPr>
-                <w:sz w:val="17"/>
-              </w:rPr>
-              <w:t>Dưới 60 giây (So với chuyên gia đọc thủ công mất 30-45 phút)</w:t>
-            </w:r>
-          </w:p>
-        </w:tc>
-      </w:tr>
-    </w:tbl>
-    <w:p>
-      <w:pPr>
-        <w:spacing w:after="120"/>
-      </w:pPr>
-    </w:p>
-    <w:p>
-      <w:pPr>
-        <w:spacing w:before="160" w:after="60"/>
-      </w:pPr>
-      <w:r>
-        <w:rPr>
-          <w:b/>
-          <w:color w:val="0066CC"/>
-          <w:sz w:val="21"/>
-        </w:rPr>
-        <w:t>Kịch bản Demo 3 phút ăn điểm tuyệt đối trước Hội đồng:</w:t>
-      </w:r>
-    </w:p>
-    <w:tbl>
-      <w:tblPr>
-        <w:tblW w:type="auto" w:w="0"/>
-        <w:jc w:val="center"/>
-        <w:tblLook w:firstColumn="1" w:firstRow="1" w:lastColumn="0" w:lastRow="0" w:noHBand="0" w:noVBand="1" w:val="04A0"/>
-      </w:tblPr>
-      <w:tblGrid>
-        <w:gridCol w:w="9936"/>
-      </w:tblGrid>
-      <w:tr>
-        <w:tc>
-          <w:tcPr>
-            <w:tcW w:type="dxa" w:w="9936"/>
-            <w:shd w:fill="FEF3C7"/>
-            <w:tcMar>
-              <w:top w:w="80" w:type="dxa"/>
-              <w:bottom w:w="80" w:type="dxa"/>
-              <w:left w:w="120" w:type="dxa"/>
-              <w:right w:w="120" w:type="dxa"/>
-            </w:tcMar>
-          </w:tcPr>
-          <w:p>
-            <w:pPr>
-              <w:spacing w:after="0"/>
-            </w:pPr>
-            <w:r>
-              <w:rPr>
-                <w:b/>
-                <w:color w:val="92400E"/>
-              </w:rPr>
-              <w:t>KỊCH BẢN BẢO VỆ 3 BƯỚC THỰC CHIẾN:</w:t>
-              <w:br/>
-              <w:br/>
-            </w:r>
-            <w:r>
-              <w:t>• Phút 1 (Nhận tin): Lâm mở Threat Intel Dashboard, copy link một bài phân tích mã độc mới xuất bản hôm nay trên TheHackerNews/BleepingComputer dán vào ô 'Phân tích tình báo khẩn cấp'. Bấm nút 'Kích hoạt Agent'.</w:t>
-              <w:br/>
-              <w:br/>
-            </w:r>
-            <w:r>
-              <w:t>• Phút 2 (Agent hoạt động): Chiếu quy trình LangGraph của Phúc: AI bóc tách ra 12 IP C2, 5 mã SHA256 mã độc, ánh xạ ngay sang kỹ thuật T1059 (Command Execution) và T1566 (Phishing). Khang gọi API VirusTotal hiển thị điểm đe dọa đỏ rực (Malicious: 58/70 engine).</w:t>
-              <w:br/>
-              <w:br/>
-            </w:r>
-            <w:r>
-              <w:t>• Phút 3 (Sản phẩm đầu ra): Dashboard lập tức hiển thị bản đồ tương quan IOC, đồng thời hiển thị nút: 'Tải về Sigma Rule cho SIEM' và 'Tải về YARA Rule cho Endpoint'. Bấm nút tải file -&gt; Mở file cho thầy cô xem rule phòng thủ được sinh hoàn hảo -&gt; Kết thúc bảo vệ trọn vẹn.</w:t>
-            </w:r>
-          </w:p>
-        </w:tc>
-      </w:tr>
-    </w:tbl>
-    <w:p>
-      <w:r>
-        <w:br w:type="page"/>
-      </w:r>
-    </w:p>
-    <w:p>
-      <w:pPr>
-        <w:spacing w:before="240" w:after="80"/>
-      </w:pPr>
-      <w:r>
-        <w:rPr>
-          <w:b/>
-          <w:color w:val="102C57"/>
-          <w:sz w:val="25"/>
-        </w:rPr>
-        <w:t>5. BẢNG CHECKLIST CHI TIẾT 12 TUẦN THEO TỪNG THÀNH VIÊN</w:t>
-      </w:r>
-    </w:p>
-    <w:p>
-      <w:r>
-        <w:t>Bảng theo dõi tiến độ cụ thể cho Phúc, Khang và Lâm theo đề tài Cyber Threat Intelligence (CTI):</w:t>
+        <w:t>2. BẢNG CHECKLIST CHI TIẾT THEO TỪNG TUẦN (TIẾN ĐỘ 8 TUẦN)</w:t>
       </w:r>
     </w:p>
     <w:tbl>
@@ -1870,8 +609,8 @@
             <w:gridSpan w:val="3"/>
             <w:shd w:fill="1E3A8A"/>
             <w:tcMar>
-              <w:top w:w="50" w:type="dxa"/>
-              <w:bottom w:w="50" w:type="dxa"/>
+              <w:top w:w="45" w:type="dxa"/>
+              <w:bottom w:w="45" w:type="dxa"/>
               <w:left w:w="80" w:type="dxa"/>
               <w:right w:w="80" w:type="dxa"/>
             </w:tcMar>
@@ -1883,7 +622,7 @@
                 <w:color w:val="FFFFFF"/>
                 <w:sz w:val="18"/>
               </w:rPr>
-              <w:t>TUẦN 1: KHỞI ĐỘNG &amp; THIẾT KẾ CƠ SỞ</w:t>
+              <w:t>TUẦN 1: KHỞI ĐỘNG, KIẾN TRÚC &amp; THIẾT LẬP MÔI TRƯỜNG</w:t>
             </w:r>
           </w:p>
         </w:tc>
@@ -1914,7 +653,7 @@
               <w:rPr>
                 <w:sz w:val="17"/>
               </w:rPr>
-              <w:t>Chốt đề cương CTI, phân công vai trò, thiết lập Repo Git</w:t>
+              <w:t>Chốt đề cương, thiết kế luồng Multi-Agent và dựng khung dự án</w:t>
             </w:r>
           </w:p>
         </w:tc>
@@ -1925,8 +664,8 @@
             <w:tcW w:type="dxa" w:w="3312"/>
             <w:shd w:fill="F1F5F9"/>
             <w:tcMar>
-              <w:top w:w="45" w:type="dxa"/>
-              <w:bottom w:w="45" w:type="dxa"/>
+              <w:top w:w="40" w:type="dxa"/>
+              <w:bottom w:w="40" w:type="dxa"/>
               <w:left w:w="60" w:type="dxa"/>
               <w:right w:w="60" w:type="dxa"/>
             </w:tcMar>
@@ -1946,8 +685,8 @@
             <w:tcW w:type="dxa" w:w="3312"/>
             <w:shd w:fill="FFFFFF"/>
             <w:tcMar>
-              <w:top w:w="45" w:type="dxa"/>
-              <w:bottom w:w="45" w:type="dxa"/>
+              <w:top w:w="40" w:type="dxa"/>
+              <w:bottom w:w="40" w:type="dxa"/>
               <w:left w:w="60" w:type="dxa"/>
               <w:right w:w="60" w:type="dxa"/>
             </w:tcMar>
@@ -1957,7 +696,9 @@
               <w:rPr>
                 <w:sz w:val="16"/>
               </w:rPr>
-              <w:t>[ ] Thống nhất kiến trúc Multi-Agent CTI, khảo sát tài liệu STIX 2.1 và MITRE ATT&amp;CK.</w:t>
+              <w:t>[ ] Thiết kế LangGraph StateGraph (Ingest -&gt; Extract -&gt; Enrich -&gt; Rule).</w:t>
+              <w:br/>
+              <w:t>[ ] Định nghĩa cấu trúc State dữ liệu chung trong shared/schemas.py.</w:t>
             </w:r>
           </w:p>
         </w:tc>
@@ -1966,8 +707,8 @@
             <w:tcW w:type="dxa" w:w="3312"/>
             <w:shd w:fill="F8FAFC"/>
             <w:tcMar>
-              <w:top w:w="45" w:type="dxa"/>
-              <w:bottom w:w="45" w:type="dxa"/>
+              <w:top w:w="40" w:type="dxa"/>
+              <w:bottom w:w="40" w:type="dxa"/>
               <w:left w:w="60" w:type="dxa"/>
               <w:right w:w="60" w:type="dxa"/>
             </w:tcMar>
@@ -1992,8 +733,8 @@
             <w:tcW w:type="dxa" w:w="3312"/>
             <w:shd w:fill="F1F5F9"/>
             <w:tcMar>
-              <w:top w:w="45" w:type="dxa"/>
-              <w:bottom w:w="45" w:type="dxa"/>
+              <w:top w:w="40" w:type="dxa"/>
+              <w:bottom w:w="40" w:type="dxa"/>
               <w:left w:w="60" w:type="dxa"/>
               <w:right w:w="60" w:type="dxa"/>
             </w:tcMar>
@@ -2013,8 +754,8 @@
             <w:tcW w:type="dxa" w:w="3312"/>
             <w:shd w:fill="FFFFFF"/>
             <w:tcMar>
-              <w:top w:w="45" w:type="dxa"/>
-              <w:bottom w:w="45" w:type="dxa"/>
+              <w:top w:w="40" w:type="dxa"/>
+              <w:bottom w:w="40" w:type="dxa"/>
               <w:left w:w="60" w:type="dxa"/>
               <w:right w:w="60" w:type="dxa"/>
             </w:tcMar>
@@ -2024,7 +765,9 @@
               <w:rPr>
                 <w:sz w:val="16"/>
               </w:rPr>
-              <w:t>[ ] Đăng ký API key miễn phí: VirusTotal, AbuseIPDB, AlienVault OTX.</w:t>
+              <w:t>[ ] Đăng ký API Key miễn phí (VirusTotal, AbuseIPDB, Shodan).</w:t>
+              <w:br/>
+              <w:t>[ ] Nghiên cứu định dạng dữ liệu chuẩn quốc tế STIX 2.1.</w:t>
             </w:r>
           </w:p>
         </w:tc>
@@ -2033,8 +776,8 @@
             <w:tcW w:type="dxa" w:w="3312"/>
             <w:shd w:fill="F8FAFC"/>
             <w:tcMar>
-              <w:top w:w="45" w:type="dxa"/>
-              <w:bottom w:w="45" w:type="dxa"/>
+              <w:top w:w="40" w:type="dxa"/>
+              <w:bottom w:w="40" w:type="dxa"/>
               <w:left w:w="60" w:type="dxa"/>
               <w:right w:w="60" w:type="dxa"/>
             </w:tcMar>
@@ -2059,8 +802,8 @@
             <w:tcW w:type="dxa" w:w="3312"/>
             <w:shd w:fill="F1F5F9"/>
             <w:tcMar>
-              <w:top w:w="45" w:type="dxa"/>
-              <w:bottom w:w="45" w:type="dxa"/>
+              <w:top w:w="40" w:type="dxa"/>
+              <w:bottom w:w="40" w:type="dxa"/>
               <w:left w:w="60" w:type="dxa"/>
               <w:right w:w="60" w:type="dxa"/>
             </w:tcMar>
@@ -2080,8 +823,8 @@
             <w:tcW w:type="dxa" w:w="3312"/>
             <w:shd w:fill="FFFFFF"/>
             <w:tcMar>
-              <w:top w:w="45" w:type="dxa"/>
-              <w:bottom w:w="45" w:type="dxa"/>
+              <w:top w:w="40" w:type="dxa"/>
+              <w:bottom w:w="40" w:type="dxa"/>
               <w:left w:w="60" w:type="dxa"/>
               <w:right w:w="60" w:type="dxa"/>
             </w:tcMar>
@@ -2091,7 +834,9 @@
               <w:rPr>
                 <w:sz w:val="16"/>
               </w:rPr>
-              <w:t>[ ] Tạo Git Repo, cấu hình phân quyền, soạn thảo đề cương CTI nộp trường.</w:t>
+              <w:t>[ ] Khởi tạo Git Repo, cấu hình phân quyền branch, file identity.txt.</w:t>
+              <w:br/>
+              <w:t>[ ] Dựng khung FastAPI Backend và script sync.py đồng bộ.</w:t>
             </w:r>
           </w:p>
         </w:tc>
@@ -2100,8 +845,8 @@
             <w:tcW w:type="dxa" w:w="3312"/>
             <w:shd w:fill="F8FAFC"/>
             <w:tcMar>
-              <w:top w:w="45" w:type="dxa"/>
-              <w:bottom w:w="45" w:type="dxa"/>
+              <w:top w:w="40" w:type="dxa"/>
+              <w:bottom w:w="40" w:type="dxa"/>
               <w:left w:w="60" w:type="dxa"/>
               <w:right w:w="60" w:type="dxa"/>
             </w:tcMar>
@@ -2146,7 +891,7 @@
               <w:rPr>
                 <w:sz w:val="17"/>
               </w:rPr>
-              <w:t>Bản đề cương CTI hoàn chỉnh nộp giảng viên &amp; Repo GitHub sẵn sàng.</w:t>
+              <w:t>Bản đề cương nộp trường, Repo GitHub sẵn sàng, Sơ đồ kiến trúc.</w:t>
             </w:r>
           </w:p>
         </w:tc>
@@ -2175,8 +920,8 @@
             <w:gridSpan w:val="3"/>
             <w:shd w:fill="1E3A8A"/>
             <w:tcMar>
-              <w:top w:w="50" w:type="dxa"/>
-              <w:bottom w:w="50" w:type="dxa"/>
+              <w:top w:w="45" w:type="dxa"/>
+              <w:bottom w:w="45" w:type="dxa"/>
               <w:left w:w="80" w:type="dxa"/>
               <w:right w:w="80" w:type="dxa"/>
             </w:tcMar>
@@ -2188,7 +933,7 @@
                 <w:color w:val="FFFFFF"/>
                 <w:sz w:val="18"/>
               </w:rPr>
-              <w:t>TUẦN 2: THIẾT KẾ KIẾN TRÚC HỆ THỐNG</w:t>
+              <w:t>TUẦN 2: BÓC TÁCH IOC &amp; THU THẬP DỮ LIỆU ĐA NGUỒN</w:t>
             </w:r>
           </w:p>
         </w:tc>
@@ -2219,7 +964,7 @@
               <w:rPr>
                 <w:sz w:val="17"/>
               </w:rPr>
-              <w:t>Thiết kế đồ thị LangGraph và Pipeline dữ liệu</w:t>
+              <w:t>AI bóc tách được IOC đầu tiên &amp; Thu thập được bài viết tự động</w:t>
             </w:r>
           </w:p>
         </w:tc>
@@ -2230,8 +975,8 @@
             <w:tcW w:type="dxa" w:w="3312"/>
             <w:shd w:fill="F1F5F9"/>
             <w:tcMar>
-              <w:top w:w="45" w:type="dxa"/>
-              <w:bottom w:w="45" w:type="dxa"/>
+              <w:top w:w="40" w:type="dxa"/>
+              <w:bottom w:w="40" w:type="dxa"/>
               <w:left w:w="60" w:type="dxa"/>
               <w:right w:w="60" w:type="dxa"/>
             </w:tcMar>
@@ -2251,8 +996,8 @@
             <w:tcW w:type="dxa" w:w="3312"/>
             <w:shd w:fill="FFFFFF"/>
             <w:tcMar>
-              <w:top w:w="45" w:type="dxa"/>
-              <w:bottom w:w="45" w:type="dxa"/>
+              <w:top w:w="40" w:type="dxa"/>
+              <w:bottom w:w="40" w:type="dxa"/>
               <w:left w:w="60" w:type="dxa"/>
               <w:right w:w="60" w:type="dxa"/>
             </w:tcMar>
@@ -2262,7 +1007,9 @@
               <w:rPr>
                 <w:sz w:val="16"/>
               </w:rPr>
-              <w:t>[ ] Thiết kế LangGraph StateGraph (Ingest -&gt; Extract -&gt; Enrich -&gt; Rule).</w:t>
+              <w:t>[ ] Viết Prompt IOC Extractor bóc tách IP, Domain, Hash, CVE từ văn bản.</w:t>
+              <w:br/>
+              <w:t>[ ] Thử nghiệm gọi LLM (DeepSeek / Qwen 2.5 Coder) bóc tách JSON chuẩn.</w:t>
             </w:r>
           </w:p>
         </w:tc>
@@ -2271,8 +1018,8 @@
             <w:tcW w:type="dxa" w:w="3312"/>
             <w:shd w:fill="F8FAFC"/>
             <w:tcMar>
-              <w:top w:w="45" w:type="dxa"/>
-              <w:bottom w:w="45" w:type="dxa"/>
+              <w:top w:w="40" w:type="dxa"/>
+              <w:bottom w:w="40" w:type="dxa"/>
               <w:left w:w="60" w:type="dxa"/>
               <w:right w:w="60" w:type="dxa"/>
             </w:tcMar>
@@ -2297,8 +1044,8 @@
             <w:tcW w:type="dxa" w:w="3312"/>
             <w:shd w:fill="F1F5F9"/>
             <w:tcMar>
-              <w:top w:w="45" w:type="dxa"/>
-              <w:bottom w:w="45" w:type="dxa"/>
+              <w:top w:w="40" w:type="dxa"/>
+              <w:bottom w:w="40" w:type="dxa"/>
               <w:left w:w="60" w:type="dxa"/>
               <w:right w:w="60" w:type="dxa"/>
             </w:tcMar>
@@ -2318,8 +1065,8 @@
             <w:tcW w:type="dxa" w:w="3312"/>
             <w:shd w:fill="FFFFFF"/>
             <w:tcMar>
-              <w:top w:w="45" w:type="dxa"/>
-              <w:bottom w:w="45" w:type="dxa"/>
+              <w:top w:w="40" w:type="dxa"/>
+              <w:bottom w:w="40" w:type="dxa"/>
               <w:left w:w="60" w:type="dxa"/>
               <w:right w:w="60" w:type="dxa"/>
             </w:tcMar>
@@ -2329,7 +1076,9 @@
               <w:rPr>
                 <w:sz w:val="16"/>
               </w:rPr>
-              <w:t>[ ] Thiết kế cấu trúc lưu trữ dữ liệu STIX 2.1 và định dạng JSON chung.</w:t>
+              <w:t>[ ] Viết script Python kết nối VirusTotal API kiểm tra danh tiếng IP/Hash.</w:t>
+              <w:br/>
+              <w:t>[ ] Viết hàm bóc tách thông tin engine gắn cờ độc hại.</w:t>
             </w:r>
           </w:p>
         </w:tc>
@@ -2338,8 +1087,8 @@
             <w:tcW w:type="dxa" w:w="3312"/>
             <w:shd w:fill="F8FAFC"/>
             <w:tcMar>
-              <w:top w:w="45" w:type="dxa"/>
-              <w:bottom w:w="45" w:type="dxa"/>
+              <w:top w:w="40" w:type="dxa"/>
+              <w:bottom w:w="40" w:type="dxa"/>
               <w:left w:w="60" w:type="dxa"/>
               <w:right w:w="60" w:type="dxa"/>
             </w:tcMar>
@@ -2364,8 +1113,8 @@
             <w:tcW w:type="dxa" w:w="3312"/>
             <w:shd w:fill="F1F5F9"/>
             <w:tcMar>
-              <w:top w:w="45" w:type="dxa"/>
-              <w:bottom w:w="45" w:type="dxa"/>
+              <w:top w:w="40" w:type="dxa"/>
+              <w:bottom w:w="40" w:type="dxa"/>
               <w:left w:w="60" w:type="dxa"/>
               <w:right w:w="60" w:type="dxa"/>
             </w:tcMar>
@@ -2385,8 +1134,8 @@
             <w:tcW w:type="dxa" w:w="3312"/>
             <w:shd w:fill="FFFFFF"/>
             <w:tcMar>
-              <w:top w:w="45" w:type="dxa"/>
-              <w:bottom w:w="45" w:type="dxa"/>
+              <w:top w:w="40" w:type="dxa"/>
+              <w:bottom w:w="40" w:type="dxa"/>
               <w:left w:w="60" w:type="dxa"/>
               <w:right w:w="60" w:type="dxa"/>
             </w:tcMar>
@@ -2396,7 +1145,9 @@
               <w:rPr>
                 <w:sz w:val="16"/>
               </w:rPr>
-              <w:t>[ ] Thiết kế kiến trúc FastAPI Backend và khung Web Dashboard.</w:t>
+              <w:t>[ ] Viết module Collector cào tin tự động từ RSS TheHackerNews, BleepingComputer.</w:t>
+              <w:br/>
+              <w:t>[ ] Lưu trữ bài viết thô vào Database dạng RawThreatData.</w:t>
             </w:r>
           </w:p>
         </w:tc>
@@ -2405,8 +1156,8 @@
             <w:tcW w:type="dxa" w:w="3312"/>
             <w:shd w:fill="F8FAFC"/>
             <w:tcMar>
-              <w:top w:w="45" w:type="dxa"/>
-              <w:bottom w:w="45" w:type="dxa"/>
+              <w:top w:w="40" w:type="dxa"/>
+              <w:bottom w:w="40" w:type="dxa"/>
               <w:left w:w="60" w:type="dxa"/>
               <w:right w:w="60" w:type="dxa"/>
             </w:tcMar>
@@ -2451,7 +1202,7 @@
               <w:rPr>
                 <w:sz w:val="17"/>
               </w:rPr>
-              <w:t>Sơ đồ luồng Multi-Agent CTI &amp; Tài liệu thiết kế hệ thống.</w:t>
+              <w:t>Tool cào tin chạy tự động, Agent bóc tách được danh sách IOC thô.</w:t>
             </w:r>
           </w:p>
         </w:tc>
@@ -2480,8 +1231,8 @@
             <w:gridSpan w:val="3"/>
             <w:shd w:fill="1E3A8A"/>
             <w:tcMar>
-              <w:top w:w="50" w:type="dxa"/>
-              <w:bottom w:w="50" w:type="dxa"/>
+              <w:top w:w="45" w:type="dxa"/>
+              <w:bottom w:w="45" w:type="dxa"/>
               <w:left w:w="80" w:type="dxa"/>
               <w:right w:w="80" w:type="dxa"/>
             </w:tcMar>
@@ -2493,7 +1244,7 @@
                 <w:color w:val="FFFFFF"/>
                 <w:sz w:val="18"/>
               </w:rPr>
-              <w:t>TUẦN 3: MODULE THU THẬP &amp; EXTRACTOR SƠ BỘ</w:t>
+              <w:t>TUẦN 3: LÀM GIÀU DỮ LIỆU &amp; ÁNH XẠ MITRE ATT&amp;CK</w:t>
             </w:r>
           </w:p>
         </w:tc>
@@ -2524,7 +1275,7 @@
               <w:rPr>
                 <w:sz w:val="17"/>
               </w:rPr>
-              <w:t>Xây dựng Collector cào tin và Prompt bóc tách IOC</w:t>
+              <w:t>Kết nối API kiểm tra độ độc hại &amp; Phân tích kỹ thuật tấn công</w:t>
             </w:r>
           </w:p>
         </w:tc>
@@ -2535,8 +1286,8 @@
             <w:tcW w:type="dxa" w:w="3312"/>
             <w:shd w:fill="F1F5F9"/>
             <w:tcMar>
-              <w:top w:w="45" w:type="dxa"/>
-              <w:bottom w:w="45" w:type="dxa"/>
+              <w:top w:w="40" w:type="dxa"/>
+              <w:bottom w:w="40" w:type="dxa"/>
               <w:left w:w="60" w:type="dxa"/>
               <w:right w:w="60" w:type="dxa"/>
             </w:tcMar>
@@ -2556,8 +1307,8 @@
             <w:tcW w:type="dxa" w:w="3312"/>
             <w:shd w:fill="FFFFFF"/>
             <w:tcMar>
-              <w:top w:w="45" w:type="dxa"/>
-              <w:bottom w:w="45" w:type="dxa"/>
+              <w:top w:w="40" w:type="dxa"/>
+              <w:bottom w:w="40" w:type="dxa"/>
               <w:left w:w="60" w:type="dxa"/>
               <w:right w:w="60" w:type="dxa"/>
             </w:tcMar>
@@ -2567,7 +1318,9 @@
               <w:rPr>
                 <w:sz w:val="16"/>
               </w:rPr>
-              <w:t>[ ] Viết Prompt IOC Extractor bóc tách IP, Domain, Hash, CVE từ văn bản.</w:t>
+              <w:t>[ ] Viết Prompt MITRE ATT&amp;CK Mapper nhận diện chiến thuật và mã T-code.</w:t>
+              <w:br/>
+              <w:t>[ ] Xây dựng bộ lọc loại bỏ IOC nhiễu (IP nội bộ 192.168.x, domain sạch).</w:t>
             </w:r>
           </w:p>
         </w:tc>
@@ -2576,8 +1329,8 @@
             <w:tcW w:type="dxa" w:w="3312"/>
             <w:shd w:fill="F8FAFC"/>
             <w:tcMar>
-              <w:top w:w="45" w:type="dxa"/>
-              <w:bottom w:w="45" w:type="dxa"/>
+              <w:top w:w="40" w:type="dxa"/>
+              <w:bottom w:w="40" w:type="dxa"/>
               <w:left w:w="60" w:type="dxa"/>
               <w:right w:w="60" w:type="dxa"/>
             </w:tcMar>
@@ -2602,8 +1355,8 @@
             <w:tcW w:type="dxa" w:w="3312"/>
             <w:shd w:fill="F1F5F9"/>
             <w:tcMar>
-              <w:top w:w="45" w:type="dxa"/>
-              <w:bottom w:w="45" w:type="dxa"/>
+              <w:top w:w="40" w:type="dxa"/>
+              <w:bottom w:w="40" w:type="dxa"/>
               <w:left w:w="60" w:type="dxa"/>
               <w:right w:w="60" w:type="dxa"/>
             </w:tcMar>
@@ -2623,8 +1376,8 @@
             <w:tcW w:type="dxa" w:w="3312"/>
             <w:shd w:fill="FFFFFF"/>
             <w:tcMar>
-              <w:top w:w="45" w:type="dxa"/>
-              <w:bottom w:w="45" w:type="dxa"/>
+              <w:top w:w="40" w:type="dxa"/>
+              <w:bottom w:w="40" w:type="dxa"/>
               <w:left w:w="60" w:type="dxa"/>
               <w:right w:w="60" w:type="dxa"/>
             </w:tcMar>
@@ -2634,7 +1387,9 @@
               <w:rPr>
                 <w:sz w:val="16"/>
               </w:rPr>
-              <w:t>[ ] Viết module Python gọi API VirusTotal tra cứu danh tiếng của IP/Hash.</w:t>
+              <w:t>[ ] Tích hợp AbuseIPDB API để lấy điểm tự tin đe dọa (Abuse Score 0-100).</w:t>
+              <w:br/>
+              <w:t>[ ] Hoàn thiện module enrichment_service.py xuất ra EnrichedIOC.</w:t>
             </w:r>
           </w:p>
         </w:tc>
@@ -2643,8 +1398,8 @@
             <w:tcW w:type="dxa" w:w="3312"/>
             <w:shd w:fill="F8FAFC"/>
             <w:tcMar>
-              <w:top w:w="45" w:type="dxa"/>
-              <w:bottom w:w="45" w:type="dxa"/>
+              <w:top w:w="40" w:type="dxa"/>
+              <w:bottom w:w="40" w:type="dxa"/>
               <w:left w:w="60" w:type="dxa"/>
               <w:right w:w="60" w:type="dxa"/>
             </w:tcMar>
@@ -2669,8 +1424,8 @@
             <w:tcW w:type="dxa" w:w="3312"/>
             <w:shd w:fill="F1F5F9"/>
             <w:tcMar>
-              <w:top w:w="45" w:type="dxa"/>
-              <w:bottom w:w="45" w:type="dxa"/>
+              <w:top w:w="40" w:type="dxa"/>
+              <w:bottom w:w="40" w:type="dxa"/>
               <w:left w:w="60" w:type="dxa"/>
               <w:right w:w="60" w:type="dxa"/>
             </w:tcMar>
@@ -2690,8 +1445,8 @@
             <w:tcW w:type="dxa" w:w="3312"/>
             <w:shd w:fill="FFFFFF"/>
             <w:tcMar>
-              <w:top w:w="45" w:type="dxa"/>
-              <w:bottom w:w="45" w:type="dxa"/>
+              <w:top w:w="40" w:type="dxa"/>
+              <w:bottom w:w="40" w:type="dxa"/>
               <w:left w:w="60" w:type="dxa"/>
               <w:right w:w="60" w:type="dxa"/>
             </w:tcMar>
@@ -2701,7 +1456,9 @@
               <w:rPr>
                 <w:sz w:val="16"/>
               </w:rPr>
-              <w:t>[ ] Viết collector cào tin tự động từ RSS TheHackerNews, BleepingComputer.</w:t>
+              <w:t>[ ] Xây dựng Database SQLite/PostgreSQL lưu trữ các IOC và báo cáo.</w:t>
+              <w:br/>
+              <w:t>[ ] Viết REST API endpoints trong FastAPI trả dữ liệu cho giao diện.</w:t>
             </w:r>
           </w:p>
         </w:tc>
@@ -2710,8 +1467,8 @@
             <w:tcW w:type="dxa" w:w="3312"/>
             <w:shd w:fill="F8FAFC"/>
             <w:tcMar>
-              <w:top w:w="45" w:type="dxa"/>
-              <w:bottom w:w="45" w:type="dxa"/>
+              <w:top w:w="40" w:type="dxa"/>
+              <w:bottom w:w="40" w:type="dxa"/>
               <w:left w:w="60" w:type="dxa"/>
               <w:right w:w="60" w:type="dxa"/>
             </w:tcMar>
@@ -2756,7 +1513,7 @@
               <w:rPr>
                 <w:sz w:val="17"/>
               </w:rPr>
-              <w:t>Script cào tin tự động xuất ra bài viết thô, Agent bóc tách được IOC đầu tiên.</w:t>
+              <w:t>Dữ liệu IOC được gắn nhãn độc hại thật/giả và gán mã MITRE ATT&amp;CK.</w:t>
             </w:r>
           </w:p>
         </w:tc>
@@ -2785,8 +1542,8 @@
             <w:gridSpan w:val="3"/>
             <w:shd w:fill="1E3A8A"/>
             <w:tcMar>
-              <w:top w:w="50" w:type="dxa"/>
-              <w:bottom w:w="50" w:type="dxa"/>
+              <w:top w:w="45" w:type="dxa"/>
+              <w:bottom w:w="45" w:type="dxa"/>
               <w:left w:w="80" w:type="dxa"/>
               <w:right w:w="80" w:type="dxa"/>
             </w:tcMar>
@@ -2798,7 +1555,7 @@
                 <w:color w:val="FFFFFF"/>
                 <w:sz w:val="18"/>
               </w:rPr>
-              <w:t>TUẦN 4: AGENT BÓC TÁCH IOC &amp; ENRICHMENT SERVICE</w:t>
+              <w:t>TUẦN 4: SINH QUY TẮC PHÒNG THỦ &amp; CHUẨN HÓA STIX 2.1</w:t>
             </w:r>
           </w:p>
         </w:tc>
@@ -2829,7 +1586,7 @@
               <w:rPr>
                 <w:sz w:val="17"/>
               </w:rPr>
-              <w:t>Hoàn thiện IOC Extraction và kết nối API bên thứ 3</w:t>
+              <w:t>AI tự động viết rule Sigma/YARA &amp; Đóng gói dữ liệu quốc tế</w:t>
             </w:r>
           </w:p>
         </w:tc>
@@ -2840,8 +1597,8 @@
             <w:tcW w:type="dxa" w:w="3312"/>
             <w:shd w:fill="F1F5F9"/>
             <w:tcMar>
-              <w:top w:w="45" w:type="dxa"/>
-              <w:bottom w:w="45" w:type="dxa"/>
+              <w:top w:w="40" w:type="dxa"/>
+              <w:bottom w:w="40" w:type="dxa"/>
               <w:left w:w="60" w:type="dxa"/>
               <w:right w:w="60" w:type="dxa"/>
             </w:tcMar>
@@ -2861,8 +1618,8 @@
             <w:tcW w:type="dxa" w:w="3312"/>
             <w:shd w:fill="FFFFFF"/>
             <w:tcMar>
-              <w:top w:w="45" w:type="dxa"/>
-              <w:bottom w:w="45" w:type="dxa"/>
+              <w:top w:w="40" w:type="dxa"/>
+              <w:bottom w:w="40" w:type="dxa"/>
               <w:left w:w="60" w:type="dxa"/>
               <w:right w:w="60" w:type="dxa"/>
             </w:tcMar>
@@ -2872,7 +1629,9 @@
               <w:rPr>
                 <w:sz w:val="16"/>
               </w:rPr>
-              <w:t>[ ] Tinh chỉnh Prompt IOC Extractor để lọc bỏ nhiễu (loại bỏ IP private 192.168.x.x, domain sạch google.com).</w:t>
+              <w:t>[ ] Viết Prompt Rule Generator tự sinh mã Sigma Rule cho SIEM và YARA Rule cho Endpoint.</w:t>
+              <w:br/>
+              <w:t>[ ] Viết hàm kiểm tra cú pháp (Validator) đảm bảo rule không bị lỗi syntax.</w:t>
             </w:r>
           </w:p>
         </w:tc>
@@ -2881,8 +1640,8 @@
             <w:tcW w:type="dxa" w:w="3312"/>
             <w:shd w:fill="F8FAFC"/>
             <w:tcMar>
-              <w:top w:w="45" w:type="dxa"/>
-              <w:bottom w:w="45" w:type="dxa"/>
+              <w:top w:w="40" w:type="dxa"/>
+              <w:bottom w:w="40" w:type="dxa"/>
               <w:left w:w="60" w:type="dxa"/>
               <w:right w:w="60" w:type="dxa"/>
             </w:tcMar>
@@ -2907,8 +1666,8 @@
             <w:tcW w:type="dxa" w:w="3312"/>
             <w:shd w:fill="F1F5F9"/>
             <w:tcMar>
-              <w:top w:w="45" w:type="dxa"/>
-              <w:bottom w:w="45" w:type="dxa"/>
+              <w:top w:w="40" w:type="dxa"/>
+              <w:bottom w:w="40" w:type="dxa"/>
               <w:left w:w="60" w:type="dxa"/>
               <w:right w:w="60" w:type="dxa"/>
             </w:tcMar>
@@ -2928,8 +1687,8 @@
             <w:tcW w:type="dxa" w:w="3312"/>
             <w:shd w:fill="FFFFFF"/>
             <w:tcMar>
-              <w:top w:w="45" w:type="dxa"/>
-              <w:bottom w:w="45" w:type="dxa"/>
+              <w:top w:w="40" w:type="dxa"/>
+              <w:bottom w:w="40" w:type="dxa"/>
               <w:left w:w="60" w:type="dxa"/>
               <w:right w:w="60" w:type="dxa"/>
             </w:tcMar>
@@ -2939,7 +1698,9 @@
               <w:rPr>
                 <w:sz w:val="16"/>
               </w:rPr>
-              <w:t>[ ] Tích hợp AbuseIPDB API và Shodan API để lấy điểm tự tin độc hại.</w:t>
+              <w:t>[ ] Xây dựng module stix_converter xuất toàn bộ IOC sang gói STIX 2.1 JSON.</w:t>
+              <w:br/>
+              <w:t>[ ] Kiểm tra tính tương thích của gói STIX trên công cụ chuẩn.</w:t>
             </w:r>
           </w:p>
         </w:tc>
@@ -2948,8 +1709,8 @@
             <w:tcW w:type="dxa" w:w="3312"/>
             <w:shd w:fill="F8FAFC"/>
             <w:tcMar>
-              <w:top w:w="45" w:type="dxa"/>
-              <w:bottom w:w="45" w:type="dxa"/>
+              <w:top w:w="40" w:type="dxa"/>
+              <w:bottom w:w="40" w:type="dxa"/>
               <w:left w:w="60" w:type="dxa"/>
               <w:right w:w="60" w:type="dxa"/>
             </w:tcMar>
@@ -2974,8 +1735,8 @@
             <w:tcW w:type="dxa" w:w="3312"/>
             <w:shd w:fill="F1F5F9"/>
             <w:tcMar>
-              <w:top w:w="45" w:type="dxa"/>
-              <w:bottom w:w="45" w:type="dxa"/>
+              <w:top w:w="40" w:type="dxa"/>
+              <w:bottom w:w="40" w:type="dxa"/>
               <w:left w:w="60" w:type="dxa"/>
               <w:right w:w="60" w:type="dxa"/>
             </w:tcMar>
@@ -2995,8 +1756,8 @@
             <w:tcW w:type="dxa" w:w="3312"/>
             <w:shd w:fill="FFFFFF"/>
             <w:tcMar>
-              <w:top w:w="45" w:type="dxa"/>
-              <w:bottom w:w="45" w:type="dxa"/>
+              <w:top w:w="40" w:type="dxa"/>
+              <w:bottom w:w="40" w:type="dxa"/>
               <w:left w:w="60" w:type="dxa"/>
               <w:right w:w="60" w:type="dxa"/>
             </w:tcMar>
@@ -3006,7 +1767,9 @@
               <w:rPr>
                 <w:sz w:val="16"/>
               </w:rPr>
-              <w:t>[ ] Xây dựng Database SQLite/PostgreSQL lưu trữ các IOC và báo cáo đã quét.</w:t>
+              <w:t>[ ] Dựng khung giao diện Web Dashboard (trang danh sách bài báo cáo).</w:t>
+              <w:br/>
+              <w:t>[ ] Thiết kế bảng hiển thị các IOC kèm điểm đe dọa màu xanh/đỏ.</w:t>
             </w:r>
           </w:p>
         </w:tc>
@@ -3015,8 +1778,8 @@
             <w:tcW w:type="dxa" w:w="3312"/>
             <w:shd w:fill="F8FAFC"/>
             <w:tcMar>
-              <w:top w:w="45" w:type="dxa"/>
-              <w:bottom w:w="45" w:type="dxa"/>
+              <w:top w:w="40" w:type="dxa"/>
+              <w:bottom w:w="40" w:type="dxa"/>
               <w:left w:w="60" w:type="dxa"/>
               <w:right w:w="60" w:type="dxa"/>
             </w:tcMar>
@@ -3061,7 +1824,7 @@
               <w:rPr>
                 <w:sz w:val="17"/>
               </w:rPr>
-              <w:t>Agent bóc tách IOC chuẩn xác và tự động gọi API làm giàu thông tin.</w:t>
+              <w:t>Agent sinh được file rule YARA/Sigma hợp lệ và xuất được gói STIX 2.1.</w:t>
             </w:r>
           </w:p>
         </w:tc>
@@ -3090,8 +1853,8 @@
             <w:gridSpan w:val="3"/>
             <w:shd w:fill="1E3A8A"/>
             <w:tcMar>
-              <w:top w:w="50" w:type="dxa"/>
-              <w:bottom w:w="50" w:type="dxa"/>
+              <w:top w:w="45" w:type="dxa"/>
+              <w:bottom w:w="45" w:type="dxa"/>
               <w:left w:w="80" w:type="dxa"/>
               <w:right w:w="80" w:type="dxa"/>
             </w:tcMar>
@@ -3103,7 +1866,7 @@
                 <w:color w:val="FFFFFF"/>
                 <w:sz w:val="18"/>
               </w:rPr>
-              <w:t>TUẦN 5: AGENT ÁNH XẠ MITRE ATT&amp;CK</w:t>
+              <w:t>TUẦN 5: GHÉP NỐI HỆ THỐNG END-TO-END (MVP HOÀN CHỈNH)</w:t>
             </w:r>
           </w:p>
         </w:tc>
@@ -3134,7 +1897,7 @@
               <w:rPr>
                 <w:sz w:val="17"/>
               </w:rPr>
-              <w:t>Xây dựng Module suy luận kỹ thuật tấn công</w:t>
+              <w:t>Chu trình khép kín: Link bài báo -&gt; Bóc tách -&gt; Làm giàu -&gt; Sinh rule</w:t>
             </w:r>
           </w:p>
         </w:tc>
@@ -3145,8 +1908,8 @@
             <w:tcW w:type="dxa" w:w="3312"/>
             <w:shd w:fill="F1F5F9"/>
             <w:tcMar>
-              <w:top w:w="45" w:type="dxa"/>
-              <w:bottom w:w="45" w:type="dxa"/>
+              <w:top w:w="40" w:type="dxa"/>
+              <w:bottom w:w="40" w:type="dxa"/>
               <w:left w:w="60" w:type="dxa"/>
               <w:right w:w="60" w:type="dxa"/>
             </w:tcMar>
@@ -3166,8 +1929,8 @@
             <w:tcW w:type="dxa" w:w="3312"/>
             <w:shd w:fill="FFFFFF"/>
             <w:tcMar>
-              <w:top w:w="45" w:type="dxa"/>
-              <w:bottom w:w="45" w:type="dxa"/>
+              <w:top w:w="40" w:type="dxa"/>
+              <w:bottom w:w="40" w:type="dxa"/>
               <w:left w:w="60" w:type="dxa"/>
               <w:right w:w="60" w:type="dxa"/>
             </w:tcMar>
@@ -3177,7 +1940,9 @@
               <w:rPr>
                 <w:sz w:val="16"/>
               </w:rPr>
-              <w:t>[ ] Viết Prompt MITRE ATT&amp;CK Mapper nhận diện chiến thuật và kỹ thuật T-code.</w:t>
+              <w:t>[ ] Ghép nối hoàn chỉnh luồng LangGraph: Nhận bài báo -&gt; Bóc tách -&gt; Gọi Khang làm giàu -&gt; Sinh rule phòng thủ.</w:t>
+              <w:br/>
+              <w:t>[ ] Tối ưu hóa xử lý bất đồng bộ (async) và timeout API.</w:t>
             </w:r>
           </w:p>
         </w:tc>
@@ -3186,8 +1951,8 @@
             <w:tcW w:type="dxa" w:w="3312"/>
             <w:shd w:fill="F8FAFC"/>
             <w:tcMar>
-              <w:top w:w="45" w:type="dxa"/>
-              <w:bottom w:w="45" w:type="dxa"/>
+              <w:top w:w="40" w:type="dxa"/>
+              <w:bottom w:w="40" w:type="dxa"/>
               <w:left w:w="60" w:type="dxa"/>
               <w:right w:w="60" w:type="dxa"/>
             </w:tcMar>
@@ -3212,8 +1977,8 @@
             <w:tcW w:type="dxa" w:w="3312"/>
             <w:shd w:fill="F1F5F9"/>
             <w:tcMar>
-              <w:top w:w="45" w:type="dxa"/>
-              <w:bottom w:w="45" w:type="dxa"/>
+              <w:top w:w="40" w:type="dxa"/>
+              <w:bottom w:w="40" w:type="dxa"/>
               <w:left w:w="60" w:type="dxa"/>
               <w:right w:w="60" w:type="dxa"/>
             </w:tcMar>
@@ -3233,8 +1998,8 @@
             <w:tcW w:type="dxa" w:w="3312"/>
             <w:shd w:fill="FFFFFF"/>
             <w:tcMar>
-              <w:top w:w="45" w:type="dxa"/>
-              <w:bottom w:w="45" w:type="dxa"/>
+              <w:top w:w="40" w:type="dxa"/>
+              <w:bottom w:w="40" w:type="dxa"/>
               <w:left w:w="60" w:type="dxa"/>
               <w:right w:w="60" w:type="dxa"/>
             </w:tcMar>
@@ -3244,7 +2009,9 @@
               <w:rPr>
                 <w:sz w:val="16"/>
               </w:rPr>
-              <w:t>[ ] Xây dựng thư viện ánh xạ đối chiếu danh mục MITRE ATT&amp;CK v14.</w:t>
+              <w:t>[ ] Kiểm thử tính ổn định của API VirusTotal khi chạy số lượng lớn IOC.</w:t>
+              <w:br/>
+              <w:t>[ ] Bắt đầu thu thập 50 báo cáo APT từ Mandiant/CISA để làm Dataset.</w:t>
             </w:r>
           </w:p>
         </w:tc>
@@ -3253,8 +2020,8 @@
             <w:tcW w:type="dxa" w:w="3312"/>
             <w:shd w:fill="F8FAFC"/>
             <w:tcMar>
-              <w:top w:w="45" w:type="dxa"/>
-              <w:bottom w:w="45" w:type="dxa"/>
+              <w:top w:w="40" w:type="dxa"/>
+              <w:bottom w:w="40" w:type="dxa"/>
               <w:left w:w="60" w:type="dxa"/>
               <w:right w:w="60" w:type="dxa"/>
             </w:tcMar>
@@ -3279,8 +2046,8 @@
             <w:tcW w:type="dxa" w:w="3312"/>
             <w:shd w:fill="F1F5F9"/>
             <w:tcMar>
-              <w:top w:w="45" w:type="dxa"/>
-              <w:bottom w:w="45" w:type="dxa"/>
+              <w:top w:w="40" w:type="dxa"/>
+              <w:bottom w:w="40" w:type="dxa"/>
               <w:left w:w="60" w:type="dxa"/>
               <w:right w:w="60" w:type="dxa"/>
             </w:tcMar>
@@ -3300,8 +2067,8 @@
             <w:tcW w:type="dxa" w:w="3312"/>
             <w:shd w:fill="FFFFFF"/>
             <w:tcMar>
-              <w:top w:w="45" w:type="dxa"/>
-              <w:bottom w:w="45" w:type="dxa"/>
+              <w:top w:w="40" w:type="dxa"/>
+              <w:bottom w:w="40" w:type="dxa"/>
               <w:left w:w="60" w:type="dxa"/>
               <w:right w:w="60" w:type="dxa"/>
             </w:tcMar>
@@ -3311,7 +2078,7 @@
               <w:rPr>
                 <w:sz w:val="16"/>
               </w:rPr>
-              <w:t>[ ] Xây dựng API endpoints trong FastAPI để trả dữ liệu phân tích cho giao diện.</w:t>
+              <w:t>[ ] Kết nối Web Dashboard với Backend API: Người dùng dán link bài báo -&gt; Bấm nút 'Phân tích' -&gt; Hiển thị kết quả.</w:t>
             </w:r>
           </w:p>
         </w:tc>
@@ -3320,8 +2087,8 @@
             <w:tcW w:type="dxa" w:w="3312"/>
             <w:shd w:fill="F8FAFC"/>
             <w:tcMar>
-              <w:top w:w="45" w:type="dxa"/>
-              <w:bottom w:w="45" w:type="dxa"/>
+              <w:top w:w="40" w:type="dxa"/>
+              <w:bottom w:w="40" w:type="dxa"/>
               <w:left w:w="60" w:type="dxa"/>
               <w:right w:w="60" w:type="dxa"/>
             </w:tcMar>
@@ -3366,7 +2133,7 @@
               <w:rPr>
                 <w:sz w:val="17"/>
               </w:rPr>
-              <w:t>Agent nhận diện và gán được kỹ thuật MITRE ATT&amp;CK chính xác.</w:t>
+              <w:t>Hệ thống MVP chạy mượt mà từ đầu đến cuối trên trình duyệt Web.</w:t>
             </w:r>
           </w:p>
         </w:tc>
@@ -3395,8 +2162,8 @@
             <w:gridSpan w:val="3"/>
             <w:shd w:fill="1E3A8A"/>
             <w:tcMar>
-              <w:top w:w="50" w:type="dxa"/>
-              <w:bottom w:w="50" w:type="dxa"/>
+              <w:top w:w="45" w:type="dxa"/>
+              <w:bottom w:w="45" w:type="dxa"/>
               <w:left w:w="80" w:type="dxa"/>
               <w:right w:w="80" w:type="dxa"/>
             </w:tcMar>
@@ -3408,7 +2175,7 @@
                 <w:color w:val="FFFFFF"/>
                 <w:sz w:val="18"/>
               </w:rPr>
-              <w:t>TUẦN 6: AGENT SINH QUY TẮC PHÒNG THỦ (SIGMA / YARA)</w:t>
+              <w:t>TUẦN 6: HOÀN THIỆN WEB DASHBOARD &amp; ĐÓNG GÓI DOCKER</w:t>
             </w:r>
           </w:p>
         </w:tc>
@@ -3439,7 +2206,7 @@
               <w:rPr>
                 <w:sz w:val="17"/>
               </w:rPr>
-              <w:t>Tự động sinh mã rule phòng thủ</w:t>
+              <w:t>Trực quan hóa bản đồ tương quan IOC &amp; Đóng gói hệ thống</w:t>
             </w:r>
           </w:p>
         </w:tc>
@@ -3450,8 +2217,8 @@
             <w:tcW w:type="dxa" w:w="3312"/>
             <w:shd w:fill="F1F5F9"/>
             <w:tcMar>
-              <w:top w:w="45" w:type="dxa"/>
-              <w:bottom w:w="45" w:type="dxa"/>
+              <w:top w:w="40" w:type="dxa"/>
+              <w:bottom w:w="40" w:type="dxa"/>
               <w:left w:w="60" w:type="dxa"/>
               <w:right w:w="60" w:type="dxa"/>
             </w:tcMar>
@@ -3471,8 +2238,8 @@
             <w:tcW w:type="dxa" w:w="3312"/>
             <w:shd w:fill="FFFFFF"/>
             <w:tcMar>
-              <w:top w:w="45" w:type="dxa"/>
-              <w:bottom w:w="45" w:type="dxa"/>
+              <w:top w:w="40" w:type="dxa"/>
+              <w:bottom w:w="40" w:type="dxa"/>
               <w:left w:w="60" w:type="dxa"/>
               <w:right w:w="60" w:type="dxa"/>
             </w:tcMar>
@@ -3482,7 +2249,9 @@
               <w:rPr>
                 <w:sz w:val="16"/>
               </w:rPr>
-              <w:t>[ ] Viết Prompt Rule Generator tự động sinh mã Sigma Rule và YARA Rule chuẩn cú pháp.</w:t>
+              <w:t>[ ] Hoàn thiện Prompt tóm tắt chiến dịch (Executive Summary) cho báo cáo.</w:t>
+              <w:br/>
+              <w:t>[ ] Rà soát toàn bộ code trong src/core/, dọn dẹp biến thừa.</w:t>
             </w:r>
           </w:p>
         </w:tc>
@@ -3491,8 +2260,8 @@
             <w:tcW w:type="dxa" w:w="3312"/>
             <w:shd w:fill="F8FAFC"/>
             <w:tcMar>
-              <w:top w:w="45" w:type="dxa"/>
-              <w:bottom w:w="45" w:type="dxa"/>
+              <w:top w:w="40" w:type="dxa"/>
+              <w:bottom w:w="40" w:type="dxa"/>
               <w:left w:w="60" w:type="dxa"/>
               <w:right w:w="60" w:type="dxa"/>
             </w:tcMar>
@@ -3517,8 +2286,8 @@
             <w:tcW w:type="dxa" w:w="3312"/>
             <w:shd w:fill="F1F5F9"/>
             <w:tcMar>
-              <w:top w:w="45" w:type="dxa"/>
-              <w:bottom w:w="45" w:type="dxa"/>
+              <w:top w:w="40" w:type="dxa"/>
+              <w:bottom w:w="40" w:type="dxa"/>
               <w:left w:w="60" w:type="dxa"/>
               <w:right w:w="60" w:type="dxa"/>
             </w:tcMar>
@@ -3538,8 +2307,8 @@
             <w:tcW w:type="dxa" w:w="3312"/>
             <w:shd w:fill="FFFFFF"/>
             <w:tcMar>
-              <w:top w:w="45" w:type="dxa"/>
-              <w:bottom w:w="45" w:type="dxa"/>
+              <w:top w:w="40" w:type="dxa"/>
+              <w:bottom w:w="40" w:type="dxa"/>
               <w:left w:w="60" w:type="dxa"/>
               <w:right w:w="60" w:type="dxa"/>
             </w:tcMar>
@@ -3549,7 +2318,9 @@
               <w:rPr>
                 <w:sz w:val="16"/>
               </w:rPr>
-              <w:t>[ ] Viết script kiểm tra cú pháp (Validator) đảm bảo file Sigma/YARA không bị lỗi syntax.</w:t>
+              <w:t>[ ] Hoàn thiện bộ Dataset 50 báo cáo APT có nhãn chuẩn (Ground Truth).</w:t>
+              <w:br/>
+              <w:t>[ ] Viết script tự động đánh giá hàng loạt (Batch testing).</w:t>
             </w:r>
           </w:p>
         </w:tc>
@@ -3558,8 +2329,8 @@
             <w:tcW w:type="dxa" w:w="3312"/>
             <w:shd w:fill="F8FAFC"/>
             <w:tcMar>
-              <w:top w:w="45" w:type="dxa"/>
-              <w:bottom w:w="45" w:type="dxa"/>
+              <w:top w:w="40" w:type="dxa"/>
+              <w:bottom w:w="40" w:type="dxa"/>
               <w:left w:w="60" w:type="dxa"/>
               <w:right w:w="60" w:type="dxa"/>
             </w:tcMar>
@@ -3584,8 +2355,8 @@
             <w:tcW w:type="dxa" w:w="3312"/>
             <w:shd w:fill="F1F5F9"/>
             <w:tcMar>
-              <w:top w:w="45" w:type="dxa"/>
-              <w:bottom w:w="45" w:type="dxa"/>
+              <w:top w:w="40" w:type="dxa"/>
+              <w:bottom w:w="40" w:type="dxa"/>
               <w:left w:w="60" w:type="dxa"/>
               <w:right w:w="60" w:type="dxa"/>
             </w:tcMar>
@@ -3605,8 +2376,8 @@
             <w:tcW w:type="dxa" w:w="3312"/>
             <w:shd w:fill="FFFFFF"/>
             <w:tcMar>
-              <w:top w:w="45" w:type="dxa"/>
-              <w:bottom w:w="45" w:type="dxa"/>
+              <w:top w:w="40" w:type="dxa"/>
+              <w:bottom w:w="40" w:type="dxa"/>
               <w:left w:w="60" w:type="dxa"/>
               <w:right w:w="60" w:type="dxa"/>
             </w:tcMar>
@@ -3616,7 +2387,11 @@
               <w:rPr>
                 <w:sz w:val="16"/>
               </w:rPr>
-              <w:t>[ ] Dựng giao diện Web cơ bản hiển thị danh sách các bài báo cáo và IOC.</w:t>
+              <w:t>[ ] Tích hợp biểu đồ quan hệ IOC (Graph UI) và ma trận MITRE ATT&amp;CK.</w:t>
+              <w:br/>
+              <w:t>[ ] Thêm nút 'Tải về Sigma Rule' và 'Tải về YARA Rule' trực tiếp trên Web.</w:t>
+              <w:br/>
+              <w:t>[ ] Đóng gói toàn bộ hệ thống bằng Docker Compose.</w:t>
             </w:r>
           </w:p>
         </w:tc>
@@ -3625,8 +2400,8 @@
             <w:tcW w:type="dxa" w:w="3312"/>
             <w:shd w:fill="F8FAFC"/>
             <w:tcMar>
-              <w:top w:w="45" w:type="dxa"/>
-              <w:bottom w:w="45" w:type="dxa"/>
+              <w:top w:w="40" w:type="dxa"/>
+              <w:bottom w:w="40" w:type="dxa"/>
               <w:left w:w="60" w:type="dxa"/>
               <w:right w:w="60" w:type="dxa"/>
             </w:tcMar>
@@ -3671,7 +2446,7 @@
               <w:rPr>
                 <w:sz w:val="17"/>
               </w:rPr>
-              <w:t>Agent sinh được file rule YARA và Sigma hợp lệ từ bài phân tích mã độc.</w:t>
+              <w:t>Web Dashboard hoàn chỉnh, có biểu đồ đẹp mắt, Docker chạy 1 lệnh.</w:t>
             </w:r>
           </w:p>
         </w:tc>
@@ -3700,8 +2475,8 @@
             <w:gridSpan w:val="3"/>
             <w:shd w:fill="1E3A8A"/>
             <w:tcMar>
-              <w:top w:w="50" w:type="dxa"/>
-              <w:bottom w:w="50" w:type="dxa"/>
+              <w:top w:w="45" w:type="dxa"/>
+              <w:bottom w:w="45" w:type="dxa"/>
               <w:left w:w="80" w:type="dxa"/>
               <w:right w:w="80" w:type="dxa"/>
             </w:tcMar>
@@ -3713,7 +2488,7 @@
                 <w:color w:val="FFFFFF"/>
                 <w:sz w:val="18"/>
               </w:rPr>
-              <w:t>TUẦN 7: TỰ ĐỘNG HÓA CHUẨN STIX 2.1</w:t>
+              <w:t>TUẦN 7: ĐO ĐẠC BENCHMARK &amp; VIẾT BÁO CÁO ĐỒ ÁN</w:t>
             </w:r>
           </w:p>
         </w:tc>
@@ -3744,7 +2519,7 @@
               <w:rPr>
                 <w:sz w:val="17"/>
               </w:rPr>
-              <w:t>Đóng gói dữ liệu tình báo chuẩn quốc tế</w:t>
+              <w:t>Thu thập số liệu khoa học và hoàn thiện bản thảo báo cáo</w:t>
             </w:r>
           </w:p>
         </w:tc>
@@ -3755,8 +2530,8 @@
             <w:tcW w:type="dxa" w:w="3312"/>
             <w:shd w:fill="F1F5F9"/>
             <w:tcMar>
-              <w:top w:w="45" w:type="dxa"/>
-              <w:bottom w:w="45" w:type="dxa"/>
+              <w:top w:w="40" w:type="dxa"/>
+              <w:bottom w:w="40" w:type="dxa"/>
               <w:left w:w="60" w:type="dxa"/>
               <w:right w:w="60" w:type="dxa"/>
             </w:tcMar>
@@ -3776,8 +2551,8 @@
             <w:tcW w:type="dxa" w:w="3312"/>
             <w:shd w:fill="FFFFFF"/>
             <w:tcMar>
-              <w:top w:w="45" w:type="dxa"/>
-              <w:bottom w:w="45" w:type="dxa"/>
+              <w:top w:w="40" w:type="dxa"/>
+              <w:bottom w:w="40" w:type="dxa"/>
               <w:left w:w="60" w:type="dxa"/>
               <w:right w:w="60" w:type="dxa"/>
             </w:tcMar>
@@ -3787,7 +2562,9 @@
               <w:rPr>
                 <w:sz w:val="16"/>
               </w:rPr>
-              <w:t>[ ] Kết nối luồng hoàn chỉnh trong LangGraph từ văn bản đến Báo cáo tình báo.</w:t>
+              <w:t>[ ] Viết Chương 2 &amp; 3 báo cáo: Kiến trúc Multi-Agent CTI, Thiết kế Prompt.</w:t>
+              <w:br/>
+              <w:t>[ ] Phân tích các trường hợp ngoại lệ (Edge Cases) của AI.</w:t>
             </w:r>
           </w:p>
         </w:tc>
@@ -3796,8 +2573,8 @@
             <w:tcW w:type="dxa" w:w="3312"/>
             <w:shd w:fill="F8FAFC"/>
             <w:tcMar>
-              <w:top w:w="45" w:type="dxa"/>
-              <w:bottom w:w="45" w:type="dxa"/>
+              <w:top w:w="40" w:type="dxa"/>
+              <w:bottom w:w="40" w:type="dxa"/>
               <w:left w:w="60" w:type="dxa"/>
               <w:right w:w="60" w:type="dxa"/>
             </w:tcMar>
@@ -3822,8 +2599,8 @@
             <w:tcW w:type="dxa" w:w="3312"/>
             <w:shd w:fill="F1F5F9"/>
             <w:tcMar>
-              <w:top w:w="45" w:type="dxa"/>
-              <w:bottom w:w="45" w:type="dxa"/>
+              <w:top w:w="40" w:type="dxa"/>
+              <w:bottom w:w="40" w:type="dxa"/>
               <w:left w:w="60" w:type="dxa"/>
               <w:right w:w="60" w:type="dxa"/>
             </w:tcMar>
@@ -3843,8 +2620,8 @@
             <w:tcW w:type="dxa" w:w="3312"/>
             <w:shd w:fill="FFFFFF"/>
             <w:tcMar>
-              <w:top w:w="45" w:type="dxa"/>
-              <w:bottom w:w="45" w:type="dxa"/>
+              <w:top w:w="40" w:type="dxa"/>
+              <w:bottom w:w="40" w:type="dxa"/>
               <w:left w:w="60" w:type="dxa"/>
               <w:right w:w="60" w:type="dxa"/>
             </w:tcMar>
@@ -3854,7 +2631,9 @@
               <w:rPr>
                 <w:sz w:val="16"/>
               </w:rPr>
-              <w:t>[ ] Viết module stix_converter xuất toàn bộ IOC và quan hệ sang STIX 2.1 JSON Bundle.</w:t>
+              <w:t>[ ] Chạy Benchmark trên 50 báo cáo APT: Tính toán Precision, Recall, F1-Score.</w:t>
+              <w:br/>
+              <w:t>[ ] Vẽ biểu đồ khoa học so sánh hiệu quả; viết Chương 1 &amp; 4 báo cáo.</w:t>
             </w:r>
           </w:p>
         </w:tc>
@@ -3863,8 +2642,8 @@
             <w:tcW w:type="dxa" w:w="3312"/>
             <w:shd w:fill="F8FAFC"/>
             <w:tcMar>
-              <w:top w:w="45" w:type="dxa"/>
-              <w:bottom w:w="45" w:type="dxa"/>
+              <w:top w:w="40" w:type="dxa"/>
+              <w:bottom w:w="40" w:type="dxa"/>
               <w:left w:w="60" w:type="dxa"/>
               <w:right w:w="60" w:type="dxa"/>
             </w:tcMar>
@@ -3889,8 +2668,8 @@
             <w:tcW w:type="dxa" w:w="3312"/>
             <w:shd w:fill="F1F5F9"/>
             <w:tcMar>
-              <w:top w:w="45" w:type="dxa"/>
-              <w:bottom w:w="45" w:type="dxa"/>
+              <w:top w:w="40" w:type="dxa"/>
+              <w:bottom w:w="40" w:type="dxa"/>
               <w:left w:w="60" w:type="dxa"/>
               <w:right w:w="60" w:type="dxa"/>
             </w:tcMar>
@@ -3910,8 +2689,8 @@
             <w:tcW w:type="dxa" w:w="3312"/>
             <w:shd w:fill="FFFFFF"/>
             <w:tcMar>
-              <w:top w:w="45" w:type="dxa"/>
-              <w:bottom w:w="45" w:type="dxa"/>
+              <w:top w:w="40" w:type="dxa"/>
+              <w:bottom w:w="40" w:type="dxa"/>
               <w:left w:w="60" w:type="dxa"/>
               <w:right w:w="60" w:type="dxa"/>
             </w:tcMar>
@@ -3921,7 +2700,9 @@
               <w:rPr>
                 <w:sz w:val="16"/>
               </w:rPr>
-              <w:t>[ ] Tích hợp tính năng tải file STIX, Sigma, YARA trực tiếp từ Web Dashboard.</w:t>
+              <w:t>[ ] Viết Chương 3: Kiến trúc Pipeline, Web Dashboard, Docker.</w:t>
+              <w:br/>
+              <w:t>[ ] Chụp màn hình Dashboard, lưu log kết quả làm minh chứng.</w:t>
             </w:r>
           </w:p>
         </w:tc>
@@ -3930,8 +2711,8 @@
             <w:tcW w:type="dxa" w:w="3312"/>
             <w:shd w:fill="F8FAFC"/>
             <w:tcMar>
-              <w:top w:w="45" w:type="dxa"/>
-              <w:bottom w:w="45" w:type="dxa"/>
+              <w:top w:w="40" w:type="dxa"/>
+              <w:bottom w:w="40" w:type="dxa"/>
               <w:left w:w="60" w:type="dxa"/>
               <w:right w:w="60" w:type="dxa"/>
             </w:tcMar>
@@ -3976,7 +2757,7 @@
               <w:rPr>
                 <w:sz w:val="17"/>
               </w:rPr>
-              <w:t>Gói dữ liệu STIX 2.1 hoàn chỉnh có thể nạp vào OpenCTI / MISP.</w:t>
+              <w:t>Bảng số liệu thực nghiệm khoa học, Bản thảo đầy đủ cuốn báo cáo.</w:t>
             </w:r>
           </w:p>
         </w:tc>
@@ -4005,8 +2786,8 @@
             <w:gridSpan w:val="3"/>
             <w:shd w:fill="1E3A8A"/>
             <w:tcMar>
-              <w:top w:w="50" w:type="dxa"/>
-              <w:bottom w:w="50" w:type="dxa"/>
+              <w:top w:w="45" w:type="dxa"/>
+              <w:bottom w:w="45" w:type="dxa"/>
               <w:left w:w="80" w:type="dxa"/>
               <w:right w:w="80" w:type="dxa"/>
             </w:tcMar>
@@ -4018,7 +2799,7 @@
                 <w:color w:val="FFFFFF"/>
                 <w:sz w:val="18"/>
               </w:rPr>
-              <w:t>TUẦN 8: TÍCH HỢP TOÀN DIỆN MVP &amp; DASHBOARD TRỰC QUAN</w:t>
+              <w:t>TUẦN 8: HOÀN THIỆN, LÀM SLIDE &amp; DIỄN TẬP BẢO VỆ</w:t>
             </w:r>
           </w:p>
         </w:tc>
@@ -4049,7 +2830,7 @@
               <w:rPr>
                 <w:sz w:val="17"/>
               </w:rPr>
-              <w:t>Ghép nối hệ thống End-to-End và hoàn thiện giao diện</w:t>
+              <w:t>Chốt báo cáo, làm slide chuyên nghiệp và diễn tập bảo vệ đạt điểm 10</w:t>
             </w:r>
           </w:p>
         </w:tc>
@@ -4060,8 +2841,8 @@
             <w:tcW w:type="dxa" w:w="3312"/>
             <w:shd w:fill="F1F5F9"/>
             <w:tcMar>
-              <w:top w:w="45" w:type="dxa"/>
-              <w:bottom w:w="45" w:type="dxa"/>
+              <w:top w:w="40" w:type="dxa"/>
+              <w:bottom w:w="40" w:type="dxa"/>
               <w:left w:w="60" w:type="dxa"/>
               <w:right w:w="60" w:type="dxa"/>
             </w:tcMar>
@@ -4081,8 +2862,8 @@
             <w:tcW w:type="dxa" w:w="3312"/>
             <w:shd w:fill="FFFFFF"/>
             <w:tcMar>
-              <w:top w:w="45" w:type="dxa"/>
-              <w:bottom w:w="45" w:type="dxa"/>
+              <w:top w:w="40" w:type="dxa"/>
+              <w:bottom w:w="40" w:type="dxa"/>
               <w:left w:w="60" w:type="dxa"/>
               <w:right w:w="60" w:type="dxa"/>
             </w:tcMar>
@@ -4092,7 +2873,7 @@
               <w:rPr>
                 <w:sz w:val="16"/>
               </w:rPr>
-              <w:t>[ ] Tối ưu hóa thời gian xử lý của LangGraph, xử lý rate limit của API VirusTotal.</w:t>
+              <w:t>[ ] Hoàn thiện Slide (phần Kiến trúc AI &amp; MITRE); chủ trì bảo vệ thử và chuẩn bị câu hỏi phản biện hội đồng.</w:t>
             </w:r>
           </w:p>
         </w:tc>
@@ -4101,8 +2882,8 @@
             <w:tcW w:type="dxa" w:w="3312"/>
             <w:shd w:fill="F8FAFC"/>
             <w:tcMar>
-              <w:top w:w="45" w:type="dxa"/>
-              <w:bottom w:w="45" w:type="dxa"/>
+              <w:top w:w="40" w:type="dxa"/>
+              <w:bottom w:w="40" w:type="dxa"/>
               <w:left w:w="60" w:type="dxa"/>
               <w:right w:w="60" w:type="dxa"/>
             </w:tcMar>
@@ -4127,8 +2908,8 @@
             <w:tcW w:type="dxa" w:w="3312"/>
             <w:shd w:fill="F1F5F9"/>
             <w:tcMar>
-              <w:top w:w="45" w:type="dxa"/>
-              <w:bottom w:w="45" w:type="dxa"/>
+              <w:top w:w="40" w:type="dxa"/>
+              <w:bottom w:w="40" w:type="dxa"/>
               <w:left w:w="60" w:type="dxa"/>
               <w:right w:w="60" w:type="dxa"/>
             </w:tcMar>
@@ -4148,8 +2929,8 @@
             <w:tcW w:type="dxa" w:w="3312"/>
             <w:shd w:fill="FFFFFF"/>
             <w:tcMar>
-              <w:top w:w="45" w:type="dxa"/>
-              <w:bottom w:w="45" w:type="dxa"/>
+              <w:top w:w="40" w:type="dxa"/>
+              <w:bottom w:w="40" w:type="dxa"/>
               <w:left w:w="60" w:type="dxa"/>
               <w:right w:w="60" w:type="dxa"/>
             </w:tcMar>
@@ -4159,7 +2940,7 @@
               <w:rPr>
                 <w:sz w:val="16"/>
               </w:rPr>
-              <w:t>[ ] Hỗ trợ kiểm thử hệ thống trên 10 bài phân tích APT thực tế.</w:t>
+              <w:t>[ ] Hoàn thiện Slide (phần Threat Enrichment &amp; Số liệu đo đạc khoa học).</w:t>
             </w:r>
           </w:p>
         </w:tc>
@@ -4168,8 +2949,8 @@
             <w:tcW w:type="dxa" w:w="3312"/>
             <w:shd w:fill="F8FAFC"/>
             <w:tcMar>
-              <w:top w:w="45" w:type="dxa"/>
-              <w:bottom w:w="45" w:type="dxa"/>
+              <w:top w:w="40" w:type="dxa"/>
+              <w:bottom w:w="40" w:type="dxa"/>
               <w:left w:w="60" w:type="dxa"/>
               <w:right w:w="60" w:type="dxa"/>
             </w:tcMar>
@@ -4194,8 +2975,8 @@
             <w:tcW w:type="dxa" w:w="3312"/>
             <w:shd w:fill="F1F5F9"/>
             <w:tcMar>
-              <w:top w:w="45" w:type="dxa"/>
-              <w:bottom w:w="45" w:type="dxa"/>
+              <w:top w:w="40" w:type="dxa"/>
+              <w:bottom w:w="40" w:type="dxa"/>
               <w:left w:w="60" w:type="dxa"/>
               <w:right w:w="60" w:type="dxa"/>
             </w:tcMar>
@@ -4215,8 +2996,8 @@
             <w:tcW w:type="dxa" w:w="3312"/>
             <w:shd w:fill="FFFFFF"/>
             <w:tcMar>
-              <w:top w:w="45" w:type="dxa"/>
-              <w:bottom w:w="45" w:type="dxa"/>
+              <w:top w:w="40" w:type="dxa"/>
+              <w:bottom w:w="40" w:type="dxa"/>
               <w:left w:w="60" w:type="dxa"/>
               <w:right w:w="60" w:type="dxa"/>
             </w:tcMar>
@@ -4226,7 +3007,7 @@
               <w:rPr>
                 <w:sz w:val="16"/>
               </w:rPr>
-              <w:t>[ ] Hoàn thiện Dashboard: vẽ biểu đồ quan hệ IOC (Graph) và ma trận MITRE ATT&amp;CK.</w:t>
+              <w:t>[ ] Hoàn thiện Slide (phần Demo Dashboard); quay 01 video demo 3 phút dự phòng (đề phòng mạng trường chập chờn).</w:t>
             </w:r>
           </w:p>
         </w:tc>
@@ -4235,8 +3016,8 @@
             <w:tcW w:type="dxa" w:w="3312"/>
             <w:shd w:fill="F8FAFC"/>
             <w:tcMar>
-              <w:top w:w="45" w:type="dxa"/>
-              <w:bottom w:w="45" w:type="dxa"/>
+              <w:top w:w="40" w:type="dxa"/>
+              <w:bottom w:w="40" w:type="dxa"/>
               <w:left w:w="60" w:type="dxa"/>
               <w:right w:w="60" w:type="dxa"/>
             </w:tcMar>
@@ -4281,1227 +3062,7 @@
               <w:rPr>
                 <w:sz w:val="17"/>
               </w:rPr>
-              <w:t>Hệ thống MVP chạy mượt mà từ URL bài báo đến báo cáo trực quan.</w:t>
-            </w:r>
-          </w:p>
-        </w:tc>
-      </w:tr>
-    </w:tbl>
-    <w:p>
-      <w:pPr>
-        <w:spacing w:after="80"/>
-      </w:pPr>
-    </w:p>
-    <w:tbl>
-      <w:tblPr>
-        <w:tblW w:type="auto" w:w="0"/>
-        <w:jc w:val="center"/>
-        <w:tblLook w:firstColumn="1" w:firstRow="1" w:lastColumn="0" w:lastRow="0" w:noHBand="0" w:noVBand="1" w:val="04A0"/>
-      </w:tblPr>
-      <w:tblGrid>
-        <w:gridCol w:w="3312"/>
-        <w:gridCol w:w="3312"/>
-        <w:gridCol w:w="3312"/>
-      </w:tblGrid>
-      <w:tr>
-        <w:tc>
-          <w:tcPr>
-            <w:tcW w:type="dxa" w:w="9936"/>
-            <w:gridSpan w:val="3"/>
-            <w:shd w:fill="1E3A8A"/>
-            <w:tcMar>
-              <w:top w:w="50" w:type="dxa"/>
-              <w:bottom w:w="50" w:type="dxa"/>
-              <w:left w:w="80" w:type="dxa"/>
-              <w:right w:w="80" w:type="dxa"/>
-            </w:tcMar>
-          </w:tcPr>
-          <w:p>
-            <w:r>
-              <w:rPr>
-                <w:b/>
-                <w:color w:val="FFFFFF"/>
-                <w:sz w:val="18"/>
-              </w:rPr>
-              <w:t>TUẦN 9: CHUẨN BỊ BỘ DỮ LIỆU BENCHMARK CTI</w:t>
-            </w:r>
-          </w:p>
-        </w:tc>
-      </w:tr>
-      <w:tr>
-        <w:tc>
-          <w:tcPr>
-            <w:tcW w:type="dxa" w:w="9936"/>
-            <w:gridSpan w:val="3"/>
-            <w:shd w:fill="E0F2FE"/>
-            <w:tcMar>
-              <w:top w:w="35" w:type="dxa"/>
-              <w:bottom w:w="35" w:type="dxa"/>
-              <w:left w:w="70" w:type="dxa"/>
-              <w:right w:w="70" w:type="dxa"/>
-            </w:tcMar>
-          </w:tcPr>
-          <w:p>
-            <w:r>
-              <w:rPr>
-                <w:b/>
-                <w:color w:val="0369A1"/>
-                <w:sz w:val="17"/>
-              </w:rPr>
-              <w:t xml:space="preserve">Mục tiêu tuần: </w:t>
-            </w:r>
-            <w:r>
-              <w:rPr>
-                <w:sz w:val="17"/>
-              </w:rPr>
-              <w:t>Thu thập 50-100 báo cáo APT có nhãn chuẩn</w:t>
-            </w:r>
-          </w:p>
-        </w:tc>
-      </w:tr>
-      <w:tr>
-        <w:tc>
-          <w:tcPr>
-            <w:tcW w:type="dxa" w:w="3312"/>
-            <w:shd w:fill="F1F5F9"/>
-            <w:tcMar>
-              <w:top w:w="45" w:type="dxa"/>
-              <w:bottom w:w="45" w:type="dxa"/>
-              <w:left w:w="60" w:type="dxa"/>
-              <w:right w:w="60" w:type="dxa"/>
-            </w:tcMar>
-          </w:tcPr>
-          <w:p>
-            <w:r>
-              <w:rPr>
-                <w:b/>
-                <w:sz w:val="16"/>
-              </w:rPr>
-              <w:t>👑 PHÚC (AI Core)</w:t>
-            </w:r>
-          </w:p>
-        </w:tc>
-        <w:tc>
-          <w:tcPr>
-            <w:tcW w:type="dxa" w:w="3312"/>
-            <w:shd w:fill="FFFFFF"/>
-            <w:tcMar>
-              <w:top w:w="45" w:type="dxa"/>
-              <w:bottom w:w="45" w:type="dxa"/>
-              <w:left w:w="60" w:type="dxa"/>
-              <w:right w:w="60" w:type="dxa"/>
-            </w:tcMar>
-          </w:tcPr>
-          <w:p>
-            <w:r>
-              <w:rPr>
-                <w:sz w:val="16"/>
-              </w:rPr>
-              <w:t>[ ] Tối ưu hóa Prompt hệ thống để đạt độ chính xác cao nhất.</w:t>
-            </w:r>
-          </w:p>
-        </w:tc>
-        <w:tc>
-          <w:tcPr>
-            <w:tcW w:type="dxa" w:w="3312"/>
-            <w:shd w:fill="F8FAFC"/>
-            <w:tcMar>
-              <w:top w:w="45" w:type="dxa"/>
-              <w:bottom w:w="45" w:type="dxa"/>
-              <w:left w:w="60" w:type="dxa"/>
-              <w:right w:w="60" w:type="dxa"/>
-            </w:tcMar>
-          </w:tcPr>
-          <w:p>
-            <w:pPr>
-              <w:jc w:val="center"/>
-            </w:pPr>
-            <w:r>
-              <w:rPr>
-                <w:color w:val="787878"/>
-                <w:sz w:val="16"/>
-              </w:rPr>
-              <w:t>Chưa làm [ ]</w:t>
-            </w:r>
-          </w:p>
-        </w:tc>
-      </w:tr>
-      <w:tr>
-        <w:tc>
-          <w:tcPr>
-            <w:tcW w:type="dxa" w:w="3312"/>
-            <w:shd w:fill="F1F5F9"/>
-            <w:tcMar>
-              <w:top w:w="45" w:type="dxa"/>
-              <w:bottom w:w="45" w:type="dxa"/>
-              <w:left w:w="60" w:type="dxa"/>
-              <w:right w:w="60" w:type="dxa"/>
-            </w:tcMar>
-          </w:tcPr>
-          <w:p>
-            <w:r>
-              <w:rPr>
-                <w:b/>
-                <w:sz w:val="16"/>
-              </w:rPr>
-              <w:t>🛡️ KHANG (Threat Intel)</w:t>
-            </w:r>
-          </w:p>
-        </w:tc>
-        <w:tc>
-          <w:tcPr>
-            <w:tcW w:type="dxa" w:w="3312"/>
-            <w:shd w:fill="FFFFFF"/>
-            <w:tcMar>
-              <w:top w:w="45" w:type="dxa"/>
-              <w:bottom w:w="45" w:type="dxa"/>
-              <w:left w:w="60" w:type="dxa"/>
-              <w:right w:w="60" w:type="dxa"/>
-            </w:tcMar>
-          </w:tcPr>
-          <w:p>
-            <w:r>
-              <w:rPr>
-                <w:sz w:val="16"/>
-              </w:rPr>
-              <w:t>[ ] Thu thập 50-100 báo cáo APT từ Mandiant, CISA, Kaspersky có sẵn nhãn IOC để làm Ground Truth.</w:t>
-            </w:r>
-          </w:p>
-        </w:tc>
-        <w:tc>
-          <w:tcPr>
-            <w:tcW w:type="dxa" w:w="3312"/>
-            <w:shd w:fill="F8FAFC"/>
-            <w:tcMar>
-              <w:top w:w="45" w:type="dxa"/>
-              <w:bottom w:w="45" w:type="dxa"/>
-              <w:left w:w="60" w:type="dxa"/>
-              <w:right w:w="60" w:type="dxa"/>
-            </w:tcMar>
-          </w:tcPr>
-          <w:p>
-            <w:pPr>
-              <w:jc w:val="center"/>
-            </w:pPr>
-            <w:r>
-              <w:rPr>
-                <w:color w:val="787878"/>
-                <w:sz w:val="16"/>
-              </w:rPr>
-              <w:t>Chưa làm [ ]</w:t>
-            </w:r>
-          </w:p>
-        </w:tc>
-      </w:tr>
-      <w:tr>
-        <w:tc>
-          <w:tcPr>
-            <w:tcW w:type="dxa" w:w="3312"/>
-            <w:shd w:fill="F1F5F9"/>
-            <w:tcMar>
-              <w:top w:w="45" w:type="dxa"/>
-              <w:bottom w:w="45" w:type="dxa"/>
-              <w:left w:w="60" w:type="dxa"/>
-              <w:right w:w="60" w:type="dxa"/>
-            </w:tcMar>
-          </w:tcPr>
-          <w:p>
-            <w:r>
-              <w:rPr>
-                <w:b/>
-                <w:sz w:val="16"/>
-              </w:rPr>
-              <w:t>⚙️ LÂM (Data Pipeline)</w:t>
-            </w:r>
-          </w:p>
-        </w:tc>
-        <w:tc>
-          <w:tcPr>
-            <w:tcW w:type="dxa" w:w="3312"/>
-            <w:shd w:fill="FFFFFF"/>
-            <w:tcMar>
-              <w:top w:w="45" w:type="dxa"/>
-              <w:bottom w:w="45" w:type="dxa"/>
-              <w:left w:w="60" w:type="dxa"/>
-              <w:right w:w="60" w:type="dxa"/>
-            </w:tcMar>
-          </w:tcPr>
-          <w:p>
-            <w:r>
-              <w:rPr>
-                <w:sz w:val="16"/>
-              </w:rPr>
-              <w:t>[ ] Viết script chạy hàng loạt (Batch evaluation) trên bộ dữ liệu kiểm thử.</w:t>
-            </w:r>
-          </w:p>
-        </w:tc>
-        <w:tc>
-          <w:tcPr>
-            <w:tcW w:type="dxa" w:w="3312"/>
-            <w:shd w:fill="F8FAFC"/>
-            <w:tcMar>
-              <w:top w:w="45" w:type="dxa"/>
-              <w:bottom w:w="45" w:type="dxa"/>
-              <w:left w:w="60" w:type="dxa"/>
-              <w:right w:w="60" w:type="dxa"/>
-            </w:tcMar>
-          </w:tcPr>
-          <w:p>
-            <w:pPr>
-              <w:jc w:val="center"/>
-            </w:pPr>
-            <w:r>
-              <w:rPr>
-                <w:color w:val="787878"/>
-                <w:sz w:val="16"/>
-              </w:rPr>
-              <w:t>Chưa làm [ ]</w:t>
-            </w:r>
-          </w:p>
-        </w:tc>
-      </w:tr>
-      <w:tr>
-        <w:tc>
-          <w:tcPr>
-            <w:tcW w:type="dxa" w:w="9936"/>
-            <w:gridSpan w:val="3"/>
-            <w:shd w:fill="F0FDF4"/>
-            <w:tcMar>
-              <w:top w:w="35" w:type="dxa"/>
-              <w:bottom w:w="35" w:type="dxa"/>
-              <w:left w:w="70" w:type="dxa"/>
-              <w:right w:w="70" w:type="dxa"/>
-            </w:tcMar>
-          </w:tcPr>
-          <w:p>
-            <w:r>
-              <w:rPr>
-                <w:b/>
-                <w:color w:val="166534"/>
-                <w:sz w:val="17"/>
-              </w:rPr>
-              <w:t xml:space="preserve">🎯 Sản phẩm nghiệm thu: </w:t>
-            </w:r>
-            <w:r>
-              <w:rPr>
-                <w:sz w:val="17"/>
-              </w:rPr>
-              <w:t>Bộ dữ liệu Benchmark CTI có nhãn chuẩn sẵn sàng đo đạc.</w:t>
-            </w:r>
-          </w:p>
-        </w:tc>
-      </w:tr>
-    </w:tbl>
-    <w:p>
-      <w:pPr>
-        <w:spacing w:after="80"/>
-      </w:pPr>
-    </w:p>
-    <w:tbl>
-      <w:tblPr>
-        <w:tblW w:type="auto" w:w="0"/>
-        <w:jc w:val="center"/>
-        <w:tblLook w:firstColumn="1" w:firstRow="1" w:lastColumn="0" w:lastRow="0" w:noHBand="0" w:noVBand="1" w:val="04A0"/>
-      </w:tblPr>
-      <w:tblGrid>
-        <w:gridCol w:w="3312"/>
-        <w:gridCol w:w="3312"/>
-        <w:gridCol w:w="3312"/>
-      </w:tblGrid>
-      <w:tr>
-        <w:tc>
-          <w:tcPr>
-            <w:tcW w:type="dxa" w:w="9936"/>
-            <w:gridSpan w:val="3"/>
-            <w:shd w:fill="1E3A8A"/>
-            <w:tcMar>
-              <w:top w:w="50" w:type="dxa"/>
-              <w:bottom w:w="50" w:type="dxa"/>
-              <w:left w:w="80" w:type="dxa"/>
-              <w:right w:w="80" w:type="dxa"/>
-            </w:tcMar>
-          </w:tcPr>
-          <w:p>
-            <w:r>
-              <w:rPr>
-                <w:b/>
-                <w:color w:val="FFFFFF"/>
-                <w:sz w:val="18"/>
-              </w:rPr>
-              <w:t>TUẦN 10: ĐO ĐẠC KHOA HỌC &amp; ĐÁNH GIÁ THỰC NGHIỆM</w:t>
-            </w:r>
-          </w:p>
-        </w:tc>
-      </w:tr>
-      <w:tr>
-        <w:tc>
-          <w:tcPr>
-            <w:tcW w:type="dxa" w:w="9936"/>
-            <w:gridSpan w:val="3"/>
-            <w:shd w:fill="E0F2FE"/>
-            <w:tcMar>
-              <w:top w:w="35" w:type="dxa"/>
-              <w:bottom w:w="35" w:type="dxa"/>
-              <w:left w:w="70" w:type="dxa"/>
-              <w:right w:w="70" w:type="dxa"/>
-            </w:tcMar>
-          </w:tcPr>
-          <w:p>
-            <w:r>
-              <w:rPr>
-                <w:b/>
-                <w:color w:val="0369A1"/>
-                <w:sz w:val="17"/>
-              </w:rPr>
-              <w:t xml:space="preserve">Mục tiêu tuần: </w:t>
-            </w:r>
-            <w:r>
-              <w:rPr>
-                <w:sz w:val="17"/>
-              </w:rPr>
-              <w:t>Tính toán Precision, Recall, F1-Score</w:t>
-            </w:r>
-          </w:p>
-        </w:tc>
-      </w:tr>
-      <w:tr>
-        <w:tc>
-          <w:tcPr>
-            <w:tcW w:type="dxa" w:w="3312"/>
-            <w:shd w:fill="F1F5F9"/>
-            <w:tcMar>
-              <w:top w:w="45" w:type="dxa"/>
-              <w:bottom w:w="45" w:type="dxa"/>
-              <w:left w:w="60" w:type="dxa"/>
-              <w:right w:w="60" w:type="dxa"/>
-            </w:tcMar>
-          </w:tcPr>
-          <w:p>
-            <w:r>
-              <w:rPr>
-                <w:b/>
-                <w:sz w:val="16"/>
-              </w:rPr>
-              <w:t>👑 PHÚC (AI Core)</w:t>
-            </w:r>
-          </w:p>
-        </w:tc>
-        <w:tc>
-          <w:tcPr>
-            <w:tcW w:type="dxa" w:w="3312"/>
-            <w:shd w:fill="FFFFFF"/>
-            <w:tcMar>
-              <w:top w:w="45" w:type="dxa"/>
-              <w:bottom w:w="45" w:type="dxa"/>
-              <w:left w:w="60" w:type="dxa"/>
-              <w:right w:w="60" w:type="dxa"/>
-            </w:tcMar>
-          </w:tcPr>
-          <w:p>
-            <w:r>
-              <w:rPr>
-                <w:sz w:val="16"/>
-              </w:rPr>
-              <w:t>[ ] Phân tích các lỗi trích xuất sai và tối ưu hóa hệ thống.</w:t>
-            </w:r>
-          </w:p>
-        </w:tc>
-        <w:tc>
-          <w:tcPr>
-            <w:tcW w:type="dxa" w:w="3312"/>
-            <w:shd w:fill="F8FAFC"/>
-            <w:tcMar>
-              <w:top w:w="45" w:type="dxa"/>
-              <w:bottom w:w="45" w:type="dxa"/>
-              <w:left w:w="60" w:type="dxa"/>
-              <w:right w:w="60" w:type="dxa"/>
-            </w:tcMar>
-          </w:tcPr>
-          <w:p>
-            <w:pPr>
-              <w:jc w:val="center"/>
-            </w:pPr>
-            <w:r>
-              <w:rPr>
-                <w:color w:val="787878"/>
-                <w:sz w:val="16"/>
-              </w:rPr>
-              <w:t>Chưa làm [ ]</w:t>
-            </w:r>
-          </w:p>
-        </w:tc>
-      </w:tr>
-      <w:tr>
-        <w:tc>
-          <w:tcPr>
-            <w:tcW w:type="dxa" w:w="3312"/>
-            <w:shd w:fill="F1F5F9"/>
-            <w:tcMar>
-              <w:top w:w="45" w:type="dxa"/>
-              <w:bottom w:w="45" w:type="dxa"/>
-              <w:left w:w="60" w:type="dxa"/>
-              <w:right w:w="60" w:type="dxa"/>
-            </w:tcMar>
-          </w:tcPr>
-          <w:p>
-            <w:r>
-              <w:rPr>
-                <w:b/>
-                <w:sz w:val="16"/>
-              </w:rPr>
-              <w:t>🛡️ KHANG (Threat Intel)</w:t>
-            </w:r>
-          </w:p>
-        </w:tc>
-        <w:tc>
-          <w:tcPr>
-            <w:tcW w:type="dxa" w:w="3312"/>
-            <w:shd w:fill="FFFFFF"/>
-            <w:tcMar>
-              <w:top w:w="45" w:type="dxa"/>
-              <w:bottom w:w="45" w:type="dxa"/>
-              <w:left w:w="60" w:type="dxa"/>
-              <w:right w:w="60" w:type="dxa"/>
-            </w:tcMar>
-          </w:tcPr>
-          <w:p>
-            <w:r>
-              <w:rPr>
-                <w:sz w:val="16"/>
-              </w:rPr>
-              <w:t>[ ] Tính toán Precision, Recall của việc bóc tách IOC và ánh xạ MITRE ATT&amp;CK; vẽ biểu đồ khoa học.</w:t>
-            </w:r>
-          </w:p>
-        </w:tc>
-        <w:tc>
-          <w:tcPr>
-            <w:tcW w:type="dxa" w:w="3312"/>
-            <w:shd w:fill="F8FAFC"/>
-            <w:tcMar>
-              <w:top w:w="45" w:type="dxa"/>
-              <w:bottom w:w="45" w:type="dxa"/>
-              <w:left w:w="60" w:type="dxa"/>
-              <w:right w:w="60" w:type="dxa"/>
-            </w:tcMar>
-          </w:tcPr>
-          <w:p>
-            <w:pPr>
-              <w:jc w:val="center"/>
-            </w:pPr>
-            <w:r>
-              <w:rPr>
-                <w:color w:val="787878"/>
-                <w:sz w:val="16"/>
-              </w:rPr>
-              <w:t>Chưa làm [ ]</w:t>
-            </w:r>
-          </w:p>
-        </w:tc>
-      </w:tr>
-      <w:tr>
-        <w:tc>
-          <w:tcPr>
-            <w:tcW w:type="dxa" w:w="3312"/>
-            <w:shd w:fill="F1F5F9"/>
-            <w:tcMar>
-              <w:top w:w="45" w:type="dxa"/>
-              <w:bottom w:w="45" w:type="dxa"/>
-              <w:left w:w="60" w:type="dxa"/>
-              <w:right w:w="60" w:type="dxa"/>
-            </w:tcMar>
-          </w:tcPr>
-          <w:p>
-            <w:r>
-              <w:rPr>
-                <w:b/>
-                <w:sz w:val="16"/>
-              </w:rPr>
-              <w:t>⚙️ LÂM (Data Pipeline)</w:t>
-            </w:r>
-          </w:p>
-        </w:tc>
-        <w:tc>
-          <w:tcPr>
-            <w:tcW w:type="dxa" w:w="3312"/>
-            <w:shd w:fill="FFFFFF"/>
-            <w:tcMar>
-              <w:top w:w="45" w:type="dxa"/>
-              <w:bottom w:w="45" w:type="dxa"/>
-              <w:left w:w="60" w:type="dxa"/>
-              <w:right w:w="60" w:type="dxa"/>
-            </w:tcMar>
-          </w:tcPr>
-          <w:p>
-            <w:r>
-              <w:rPr>
-                <w:sz w:val="16"/>
-              </w:rPr>
-              <w:t>[ ] Chụp ảnh Dashboard, lưu log kết quả chạy làm minh chứng cho báo cáo.</w:t>
-            </w:r>
-          </w:p>
-        </w:tc>
-        <w:tc>
-          <w:tcPr>
-            <w:tcW w:type="dxa" w:w="3312"/>
-            <w:shd w:fill="F8FAFC"/>
-            <w:tcMar>
-              <w:top w:w="45" w:type="dxa"/>
-              <w:bottom w:w="45" w:type="dxa"/>
-              <w:left w:w="60" w:type="dxa"/>
-              <w:right w:w="60" w:type="dxa"/>
-            </w:tcMar>
-          </w:tcPr>
-          <w:p>
-            <w:pPr>
-              <w:jc w:val="center"/>
-            </w:pPr>
-            <w:r>
-              <w:rPr>
-                <w:color w:val="787878"/>
-                <w:sz w:val="16"/>
-              </w:rPr>
-              <w:t>Chưa làm [ ]</w:t>
-            </w:r>
-          </w:p>
-        </w:tc>
-      </w:tr>
-      <w:tr>
-        <w:tc>
-          <w:tcPr>
-            <w:tcW w:type="dxa" w:w="9936"/>
-            <w:gridSpan w:val="3"/>
-            <w:shd w:fill="F0FDF4"/>
-            <w:tcMar>
-              <w:top w:w="35" w:type="dxa"/>
-              <w:bottom w:w="35" w:type="dxa"/>
-              <w:left w:w="70" w:type="dxa"/>
-              <w:right w:w="70" w:type="dxa"/>
-            </w:tcMar>
-          </w:tcPr>
-          <w:p>
-            <w:r>
-              <w:rPr>
-                <w:b/>
-                <w:color w:val="166534"/>
-                <w:sz w:val="17"/>
-              </w:rPr>
-              <w:t xml:space="preserve">🎯 Sản phẩm nghiệm thu: </w:t>
-            </w:r>
-            <w:r>
-              <w:rPr>
-                <w:sz w:val="17"/>
-              </w:rPr>
-              <w:t>Bảng số liệu và biểu đồ thực nghiệm khoa học hoàn chỉnh.</w:t>
-            </w:r>
-          </w:p>
-        </w:tc>
-      </w:tr>
-    </w:tbl>
-    <w:p>
-      <w:pPr>
-        <w:spacing w:after="80"/>
-      </w:pPr>
-    </w:p>
-    <w:tbl>
-      <w:tblPr>
-        <w:tblW w:type="auto" w:w="0"/>
-        <w:jc w:val="center"/>
-        <w:tblLook w:firstColumn="1" w:firstRow="1" w:lastColumn="0" w:lastRow="0" w:noHBand="0" w:noVBand="1" w:val="04A0"/>
-      </w:tblPr>
-      <w:tblGrid>
-        <w:gridCol w:w="3312"/>
-        <w:gridCol w:w="3312"/>
-        <w:gridCol w:w="3312"/>
-      </w:tblGrid>
-      <w:tr>
-        <w:tc>
-          <w:tcPr>
-            <w:tcW w:type="dxa" w:w="9936"/>
-            <w:gridSpan w:val="3"/>
-            <w:shd w:fill="1E3A8A"/>
-            <w:tcMar>
-              <w:top w:w="50" w:type="dxa"/>
-              <w:bottom w:w="50" w:type="dxa"/>
-              <w:left w:w="80" w:type="dxa"/>
-              <w:right w:w="80" w:type="dxa"/>
-            </w:tcMar>
-          </w:tcPr>
-          <w:p>
-            <w:r>
-              <w:rPr>
-                <w:b/>
-                <w:color w:val="FFFFFF"/>
-                <w:sz w:val="18"/>
-              </w:rPr>
-              <w:t>TUẦN 11: VIẾT BÁO CÁO ĐỒ ÁN CHUYÊN NGÀNH</w:t>
-            </w:r>
-          </w:p>
-        </w:tc>
-      </w:tr>
-      <w:tr>
-        <w:tc>
-          <w:tcPr>
-            <w:tcW w:type="dxa" w:w="9936"/>
-            <w:gridSpan w:val="3"/>
-            <w:shd w:fill="E0F2FE"/>
-            <w:tcMar>
-              <w:top w:w="35" w:type="dxa"/>
-              <w:bottom w:w="35" w:type="dxa"/>
-              <w:left w:w="70" w:type="dxa"/>
-              <w:right w:w="70" w:type="dxa"/>
-            </w:tcMar>
-          </w:tcPr>
-          <w:p>
-            <w:r>
-              <w:rPr>
-                <w:b/>
-                <w:color w:val="0369A1"/>
-                <w:sz w:val="17"/>
-              </w:rPr>
-              <w:t xml:space="preserve">Mục tiêu tuần: </w:t>
-            </w:r>
-            <w:r>
-              <w:rPr>
-                <w:sz w:val="17"/>
-              </w:rPr>
-              <w:t>Hoàn thiện cuốn báo cáo nộp trường</w:t>
-            </w:r>
-          </w:p>
-        </w:tc>
-      </w:tr>
-      <w:tr>
-        <w:tc>
-          <w:tcPr>
-            <w:tcW w:type="dxa" w:w="3312"/>
-            <w:shd w:fill="F1F5F9"/>
-            <w:tcMar>
-              <w:top w:w="45" w:type="dxa"/>
-              <w:bottom w:w="45" w:type="dxa"/>
-              <w:left w:w="60" w:type="dxa"/>
-              <w:right w:w="60" w:type="dxa"/>
-            </w:tcMar>
-          </w:tcPr>
-          <w:p>
-            <w:r>
-              <w:rPr>
-                <w:b/>
-                <w:sz w:val="16"/>
-              </w:rPr>
-              <w:t>👑 PHÚC (AI Core)</w:t>
-            </w:r>
-          </w:p>
-        </w:tc>
-        <w:tc>
-          <w:tcPr>
-            <w:tcW w:type="dxa" w:w="3312"/>
-            <w:shd w:fill="FFFFFF"/>
-            <w:tcMar>
-              <w:top w:w="45" w:type="dxa"/>
-              <w:bottom w:w="45" w:type="dxa"/>
-              <w:left w:w="60" w:type="dxa"/>
-              <w:right w:w="60" w:type="dxa"/>
-            </w:tcMar>
-          </w:tcPr>
-          <w:p>
-            <w:r>
-              <w:rPr>
-                <w:sz w:val="16"/>
-              </w:rPr>
-              <w:t>[ ] Viết Chương 2 &amp; 3: Kiến trúc Multi-Agent, Thiết kế Prompt và LangGraph.</w:t>
-            </w:r>
-          </w:p>
-        </w:tc>
-        <w:tc>
-          <w:tcPr>
-            <w:tcW w:type="dxa" w:w="3312"/>
-            <w:shd w:fill="F8FAFC"/>
-            <w:tcMar>
-              <w:top w:w="45" w:type="dxa"/>
-              <w:bottom w:w="45" w:type="dxa"/>
-              <w:left w:w="60" w:type="dxa"/>
-              <w:right w:w="60" w:type="dxa"/>
-            </w:tcMar>
-          </w:tcPr>
-          <w:p>
-            <w:pPr>
-              <w:jc w:val="center"/>
-            </w:pPr>
-            <w:r>
-              <w:rPr>
-                <w:color w:val="787878"/>
-                <w:sz w:val="16"/>
-              </w:rPr>
-              <w:t>Chưa làm [ ]</w:t>
-            </w:r>
-          </w:p>
-        </w:tc>
-      </w:tr>
-      <w:tr>
-        <w:tc>
-          <w:tcPr>
-            <w:tcW w:type="dxa" w:w="3312"/>
-            <w:shd w:fill="F1F5F9"/>
-            <w:tcMar>
-              <w:top w:w="45" w:type="dxa"/>
-              <w:bottom w:w="45" w:type="dxa"/>
-              <w:left w:w="60" w:type="dxa"/>
-              <w:right w:w="60" w:type="dxa"/>
-            </w:tcMar>
-          </w:tcPr>
-          <w:p>
-            <w:r>
-              <w:rPr>
-                <w:b/>
-                <w:sz w:val="16"/>
-              </w:rPr>
-              <w:t>🛡️ KHANG (Threat Intel)</w:t>
-            </w:r>
-          </w:p>
-        </w:tc>
-        <w:tc>
-          <w:tcPr>
-            <w:tcW w:type="dxa" w:w="3312"/>
-            <w:shd w:fill="FFFFFF"/>
-            <w:tcMar>
-              <w:top w:w="45" w:type="dxa"/>
-              <w:bottom w:w="45" w:type="dxa"/>
-              <w:left w:w="60" w:type="dxa"/>
-              <w:right w:w="60" w:type="dxa"/>
-            </w:tcMar>
-          </w:tcPr>
-          <w:p>
-            <w:r>
-              <w:rPr>
-                <w:sz w:val="16"/>
-              </w:rPr>
-              <w:t>[ ] Viết Chương 1 &amp; 4: Tổng quan CTI, Nền tảng làm giàu dữ liệu và Kết quả thực nghiệm.</w:t>
-            </w:r>
-          </w:p>
-        </w:tc>
-        <w:tc>
-          <w:tcPr>
-            <w:tcW w:type="dxa" w:w="3312"/>
-            <w:shd w:fill="F8FAFC"/>
-            <w:tcMar>
-              <w:top w:w="45" w:type="dxa"/>
-              <w:bottom w:w="45" w:type="dxa"/>
-              <w:left w:w="60" w:type="dxa"/>
-              <w:right w:w="60" w:type="dxa"/>
-            </w:tcMar>
-          </w:tcPr>
-          <w:p>
-            <w:pPr>
-              <w:jc w:val="center"/>
-            </w:pPr>
-            <w:r>
-              <w:rPr>
-                <w:color w:val="787878"/>
-                <w:sz w:val="16"/>
-              </w:rPr>
-              <w:t>Chưa làm [ ]</w:t>
-            </w:r>
-          </w:p>
-        </w:tc>
-      </w:tr>
-      <w:tr>
-        <w:tc>
-          <w:tcPr>
-            <w:tcW w:type="dxa" w:w="3312"/>
-            <w:shd w:fill="F1F5F9"/>
-            <w:tcMar>
-              <w:top w:w="45" w:type="dxa"/>
-              <w:bottom w:w="45" w:type="dxa"/>
-              <w:left w:w="60" w:type="dxa"/>
-              <w:right w:w="60" w:type="dxa"/>
-            </w:tcMar>
-          </w:tcPr>
-          <w:p>
-            <w:r>
-              <w:rPr>
-                <w:b/>
-                <w:sz w:val="16"/>
-              </w:rPr>
-              <w:t>⚙️ LÂM (Data Pipeline)</w:t>
-            </w:r>
-          </w:p>
-        </w:tc>
-        <w:tc>
-          <w:tcPr>
-            <w:tcW w:type="dxa" w:w="3312"/>
-            <w:shd w:fill="FFFFFF"/>
-            <w:tcMar>
-              <w:top w:w="45" w:type="dxa"/>
-              <w:bottom w:w="45" w:type="dxa"/>
-              <w:left w:w="60" w:type="dxa"/>
-              <w:right w:w="60" w:type="dxa"/>
-            </w:tcMar>
-          </w:tcPr>
-          <w:p>
-            <w:r>
-              <w:rPr>
-                <w:sz w:val="16"/>
-              </w:rPr>
-              <w:t>[ ] Viết Chương 3: Data Pipeline, Kiến trúc Dashboard, Docker Compose và file README.</w:t>
-            </w:r>
-          </w:p>
-        </w:tc>
-        <w:tc>
-          <w:tcPr>
-            <w:tcW w:type="dxa" w:w="3312"/>
-            <w:shd w:fill="F8FAFC"/>
-            <w:tcMar>
-              <w:top w:w="45" w:type="dxa"/>
-              <w:bottom w:w="45" w:type="dxa"/>
-              <w:left w:w="60" w:type="dxa"/>
-              <w:right w:w="60" w:type="dxa"/>
-            </w:tcMar>
-          </w:tcPr>
-          <w:p>
-            <w:pPr>
-              <w:jc w:val="center"/>
-            </w:pPr>
-            <w:r>
-              <w:rPr>
-                <w:color w:val="787878"/>
-                <w:sz w:val="16"/>
-              </w:rPr>
-              <w:t>Chưa làm [ ]</w:t>
-            </w:r>
-          </w:p>
-        </w:tc>
-      </w:tr>
-      <w:tr>
-        <w:tc>
-          <w:tcPr>
-            <w:tcW w:type="dxa" w:w="9936"/>
-            <w:gridSpan w:val="3"/>
-            <w:shd w:fill="F0FDF4"/>
-            <w:tcMar>
-              <w:top w:w="35" w:type="dxa"/>
-              <w:bottom w:w="35" w:type="dxa"/>
-              <w:left w:w="70" w:type="dxa"/>
-              <w:right w:w="70" w:type="dxa"/>
-            </w:tcMar>
-          </w:tcPr>
-          <w:p>
-            <w:r>
-              <w:rPr>
-                <w:b/>
-                <w:color w:val="166534"/>
-                <w:sz w:val="17"/>
-              </w:rPr>
-              <w:t xml:space="preserve">🎯 Sản phẩm nghiệm thu: </w:t>
-            </w:r>
-            <w:r>
-              <w:rPr>
-                <w:sz w:val="17"/>
-              </w:rPr>
-              <w:t>Bản thảo hoàn chỉnh (Full Draft) của cuốn báo cáo đồ án CTI.</w:t>
-            </w:r>
-          </w:p>
-        </w:tc>
-      </w:tr>
-    </w:tbl>
-    <w:p>
-      <w:pPr>
-        <w:spacing w:after="80"/>
-      </w:pPr>
-    </w:p>
-    <w:tbl>
-      <w:tblPr>
-        <w:tblW w:type="auto" w:w="0"/>
-        <w:jc w:val="center"/>
-        <w:tblLook w:firstColumn="1" w:firstRow="1" w:lastColumn="0" w:lastRow="0" w:noHBand="0" w:noVBand="1" w:val="04A0"/>
-      </w:tblPr>
-      <w:tblGrid>
-        <w:gridCol w:w="3312"/>
-        <w:gridCol w:w="3312"/>
-        <w:gridCol w:w="3312"/>
-      </w:tblGrid>
-      <w:tr>
-        <w:tc>
-          <w:tcPr>
-            <w:tcW w:type="dxa" w:w="9936"/>
-            <w:gridSpan w:val="3"/>
-            <w:shd w:fill="1E3A8A"/>
-            <w:tcMar>
-              <w:top w:w="50" w:type="dxa"/>
-              <w:bottom w:w="50" w:type="dxa"/>
-              <w:left w:w="80" w:type="dxa"/>
-              <w:right w:w="80" w:type="dxa"/>
-            </w:tcMar>
-          </w:tcPr>
-          <w:p>
-            <w:r>
-              <w:rPr>
-                <w:b/>
-                <w:color w:val="FFFFFF"/>
-                <w:sz w:val="18"/>
-              </w:rPr>
-              <w:t>TUẦN 12: LÀM SLIDE &amp; DIỄN TẬP BẢO VỆ</w:t>
-            </w:r>
-          </w:p>
-        </w:tc>
-      </w:tr>
-      <w:tr>
-        <w:tc>
-          <w:tcPr>
-            <w:tcW w:type="dxa" w:w="9936"/>
-            <w:gridSpan w:val="3"/>
-            <w:shd w:fill="E0F2FE"/>
-            <w:tcMar>
-              <w:top w:w="35" w:type="dxa"/>
-              <w:bottom w:w="35" w:type="dxa"/>
-              <w:left w:w="70" w:type="dxa"/>
-              <w:right w:w="70" w:type="dxa"/>
-            </w:tcMar>
-          </w:tcPr>
-          <w:p>
-            <w:r>
-              <w:rPr>
-                <w:b/>
-                <w:color w:val="0369A1"/>
-                <w:sz w:val="17"/>
-              </w:rPr>
-              <w:t xml:space="preserve">Mục tiêu tuần: </w:t>
-            </w:r>
-            <w:r>
-              <w:rPr>
-                <w:sz w:val="17"/>
-              </w:rPr>
-              <w:t>Chuẩn bị Slide và diễn tập bảo vệ đạt điểm 10</w:t>
-            </w:r>
-          </w:p>
-        </w:tc>
-      </w:tr>
-      <w:tr>
-        <w:tc>
-          <w:tcPr>
-            <w:tcW w:type="dxa" w:w="3312"/>
-            <w:shd w:fill="F1F5F9"/>
-            <w:tcMar>
-              <w:top w:w="45" w:type="dxa"/>
-              <w:bottom w:w="45" w:type="dxa"/>
-              <w:left w:w="60" w:type="dxa"/>
-              <w:right w:w="60" w:type="dxa"/>
-            </w:tcMar>
-          </w:tcPr>
-          <w:p>
-            <w:r>
-              <w:rPr>
-                <w:b/>
-                <w:sz w:val="16"/>
-              </w:rPr>
-              <w:t>👑 PHÚC (AI Core)</w:t>
-            </w:r>
-          </w:p>
-        </w:tc>
-        <w:tc>
-          <w:tcPr>
-            <w:tcW w:type="dxa" w:w="3312"/>
-            <w:shd w:fill="FFFFFF"/>
-            <w:tcMar>
-              <w:top w:w="45" w:type="dxa"/>
-              <w:bottom w:w="45" w:type="dxa"/>
-              <w:left w:w="60" w:type="dxa"/>
-              <w:right w:w="60" w:type="dxa"/>
-            </w:tcMar>
-          </w:tcPr>
-          <w:p>
-            <w:r>
-              <w:rPr>
-                <w:sz w:val="16"/>
-              </w:rPr>
-              <w:t>[ ] Soạn Slide (phần Kiến trúc AI &amp; MITRE); chủ trì bảo vệ thử và trả lời phản biện.</w:t>
-            </w:r>
-          </w:p>
-        </w:tc>
-        <w:tc>
-          <w:tcPr>
-            <w:tcW w:type="dxa" w:w="3312"/>
-            <w:shd w:fill="F8FAFC"/>
-            <w:tcMar>
-              <w:top w:w="45" w:type="dxa"/>
-              <w:bottom w:w="45" w:type="dxa"/>
-              <w:left w:w="60" w:type="dxa"/>
-              <w:right w:w="60" w:type="dxa"/>
-            </w:tcMar>
-          </w:tcPr>
-          <w:p>
-            <w:pPr>
-              <w:jc w:val="center"/>
-            </w:pPr>
-            <w:r>
-              <w:rPr>
-                <w:color w:val="787878"/>
-                <w:sz w:val="16"/>
-              </w:rPr>
-              <w:t>Chưa làm [ ]</w:t>
-            </w:r>
-          </w:p>
-        </w:tc>
-      </w:tr>
-      <w:tr>
-        <w:tc>
-          <w:tcPr>
-            <w:tcW w:type="dxa" w:w="3312"/>
-            <w:shd w:fill="F1F5F9"/>
-            <w:tcMar>
-              <w:top w:w="45" w:type="dxa"/>
-              <w:bottom w:w="45" w:type="dxa"/>
-              <w:left w:w="60" w:type="dxa"/>
-              <w:right w:w="60" w:type="dxa"/>
-            </w:tcMar>
-          </w:tcPr>
-          <w:p>
-            <w:r>
-              <w:rPr>
-                <w:b/>
-                <w:sz w:val="16"/>
-              </w:rPr>
-              <w:t>🛡️ KHANG (Threat Intel)</w:t>
-            </w:r>
-          </w:p>
-        </w:tc>
-        <w:tc>
-          <w:tcPr>
-            <w:tcW w:type="dxa" w:w="3312"/>
-            <w:shd w:fill="FFFFFF"/>
-            <w:tcMar>
-              <w:top w:w="45" w:type="dxa"/>
-              <w:bottom w:w="45" w:type="dxa"/>
-              <w:left w:w="60" w:type="dxa"/>
-              <w:right w:w="60" w:type="dxa"/>
-            </w:tcMar>
-          </w:tcPr>
-          <w:p>
-            <w:r>
-              <w:rPr>
-                <w:sz w:val="16"/>
-              </w:rPr>
-              <w:t>[ ] Soạn Slide (phần Threat Enrichment &amp; Benchmark số liệu).</w:t>
-            </w:r>
-          </w:p>
-        </w:tc>
-        <w:tc>
-          <w:tcPr>
-            <w:tcW w:type="dxa" w:w="3312"/>
-            <w:shd w:fill="F8FAFC"/>
-            <w:tcMar>
-              <w:top w:w="45" w:type="dxa"/>
-              <w:bottom w:w="45" w:type="dxa"/>
-              <w:left w:w="60" w:type="dxa"/>
-              <w:right w:w="60" w:type="dxa"/>
-            </w:tcMar>
-          </w:tcPr>
-          <w:p>
-            <w:pPr>
-              <w:jc w:val="center"/>
-            </w:pPr>
-            <w:r>
-              <w:rPr>
-                <w:color w:val="787878"/>
-                <w:sz w:val="16"/>
-              </w:rPr>
-              <w:t>Chưa làm [ ]</w:t>
-            </w:r>
-          </w:p>
-        </w:tc>
-      </w:tr>
-      <w:tr>
-        <w:tc>
-          <w:tcPr>
-            <w:tcW w:type="dxa" w:w="3312"/>
-            <w:shd w:fill="F1F5F9"/>
-            <w:tcMar>
-              <w:top w:w="45" w:type="dxa"/>
-              <w:bottom w:w="45" w:type="dxa"/>
-              <w:left w:w="60" w:type="dxa"/>
-              <w:right w:w="60" w:type="dxa"/>
-            </w:tcMar>
-          </w:tcPr>
-          <w:p>
-            <w:r>
-              <w:rPr>
-                <w:b/>
-                <w:sz w:val="16"/>
-              </w:rPr>
-              <w:t>⚙️ LÂM (Data Pipeline)</w:t>
-            </w:r>
-          </w:p>
-        </w:tc>
-        <w:tc>
-          <w:tcPr>
-            <w:tcW w:type="dxa" w:w="3312"/>
-            <w:shd w:fill="FFFFFF"/>
-            <w:tcMar>
-              <w:top w:w="45" w:type="dxa"/>
-              <w:bottom w:w="45" w:type="dxa"/>
-              <w:left w:w="60" w:type="dxa"/>
-              <w:right w:w="60" w:type="dxa"/>
-            </w:tcMar>
-          </w:tcPr>
-          <w:p>
-            <w:r>
-              <w:rPr>
-                <w:sz w:val="16"/>
-              </w:rPr>
-              <w:t>[ ] Soạn Slide (phần Demo Dashboard); quay 01 video demo 3 phút dự phòng.</w:t>
-            </w:r>
-          </w:p>
-        </w:tc>
-        <w:tc>
-          <w:tcPr>
-            <w:tcW w:type="dxa" w:w="3312"/>
-            <w:shd w:fill="F8FAFC"/>
-            <w:tcMar>
-              <w:top w:w="45" w:type="dxa"/>
-              <w:bottom w:w="45" w:type="dxa"/>
-              <w:left w:w="60" w:type="dxa"/>
-              <w:right w:w="60" w:type="dxa"/>
-            </w:tcMar>
-          </w:tcPr>
-          <w:p>
-            <w:pPr>
-              <w:jc w:val="center"/>
-            </w:pPr>
-            <w:r>
-              <w:rPr>
-                <w:color w:val="787878"/>
-                <w:sz w:val="16"/>
-              </w:rPr>
-              <w:t>Chưa làm [ ]</w:t>
-            </w:r>
-          </w:p>
-        </w:tc>
-      </w:tr>
-      <w:tr>
-        <w:tc>
-          <w:tcPr>
-            <w:tcW w:type="dxa" w:w="9936"/>
-            <w:gridSpan w:val="3"/>
-            <w:shd w:fill="F0FDF4"/>
-            <w:tcMar>
-              <w:top w:w="35" w:type="dxa"/>
-              <w:bottom w:w="35" w:type="dxa"/>
-              <w:left w:w="70" w:type="dxa"/>
-              <w:right w:w="70" w:type="dxa"/>
-            </w:tcMar>
-          </w:tcPr>
-          <w:p>
-            <w:r>
-              <w:rPr>
-                <w:b/>
-                <w:color w:val="166534"/>
-                <w:sz w:val="17"/>
-              </w:rPr>
-              <w:t xml:space="preserve">🎯 Sản phẩm nghiệm thu: </w:t>
-            </w:r>
-            <w:r>
-              <w:rPr>
-                <w:sz w:val="17"/>
-              </w:rPr>
-              <w:t>Slide thuyết trình hoàn chỉnh, Video demo dự phòng, sẵn sàng bảo vệ.</w:t>
+              <w:t>Cuốn báo cáo chính thức nộp trường, Slide bảo vệ, Video demo sẵn sàng.</w:t>
             </w:r>
           </w:p>
         </w:tc>

</xml_diff>